<commit_message>
chore: punto de restauración (cotización, catálogos, API y front)
Estado del trabajo en feature/articulos-definiciones-bahias-formacion-precios-operando antes de ajustar flujo de redirección al crear cotización.

Co-authored-by: Cursor <cursoragent@cursor.com>
</commit_message>
<xml_diff>
--- a/v-hormiga-app/public/assets/Cotizacion_Nueva_Con_Etiquetas.docx
+++ b/v-hormiga-app/public/assets/Cotizacion_Nueva_Con_Etiquetas.docx
@@ -5,12 +5,12 @@
     <w:p>
       <w:pPr>
         <w:widowControl/>
+        <w:ind w:left="709" w:hanging="709"/>
         <w:rPr>
           <w:rFonts w:ascii="Arial" w:hAnsi="Arial" w:cs="Arial"/>
           <w:b/>
           <w:bCs/>
           <w:szCs w:val="24"/>
-          <w:highlight w:val="yellow"/>
         </w:rPr>
       </w:pPr>
       <w:r>
@@ -23,6 +23,7 @@
         <w:t>{</w:t>
       </w:r>
       <w:proofErr w:type="spellStart"/>
+      <w:proofErr w:type="gramStart"/>
       <w:r>
         <w:rPr>
           <w:rFonts w:ascii="Arial" w:hAnsi="Arial" w:cs="Arial"/>
@@ -33,6 +34,7 @@
         <w:t>Oferta.Cliente.Nombre</w:t>
       </w:r>
       <w:proofErr w:type="spellEnd"/>
+      <w:proofErr w:type="gramEnd"/>
       <w:r>
         <w:rPr>
           <w:rFonts w:ascii="Arial" w:hAnsi="Arial" w:cs="Arial"/>
@@ -43,6 +45,94 @@
         <w:t xml:space="preserve"> del Cliente}</w:t>
       </w:r>
     </w:p>
+    <w:tbl>
+      <w:tblPr>
+        <w:tblW w:w="0" w:type="auto"/>
+        <w:tblLook w:val="0480" w:firstRow="0" w:lastRow="0" w:firstColumn="1" w:lastColumn="0" w:noHBand="0" w:noVBand="1"/>
+      </w:tblPr>
+      <w:tblGrid>
+        <w:gridCol w:w="5211"/>
+        <w:gridCol w:w="5236"/>
+        <w:gridCol w:w="236"/>
+      </w:tblGrid>
+      <w:tr>
+        <w:tc>
+          <w:tcPr>
+            <w:tcW w:w="5211" w:type="dxa"/>
+            <w:shd w:val="clear" w:color="auto" w:fill="auto"/>
+          </w:tcPr>
+          <w:p>
+            <w:pPr>
+              <w:widowControl/>
+              <w:rPr>
+                <w:rFonts w:ascii="Arial" w:hAnsi="Arial" w:cs="Arial"/>
+                <w:szCs w:val="24"/>
+                <w:highlight w:val="yellow"/>
+              </w:rPr>
+            </w:pPr>
+            <w:r>
+              <w:rPr>
+                <w:rFonts w:ascii="Arial" w:hAnsi="Arial" w:cs="Arial"/>
+                <w:szCs w:val="24"/>
+              </w:rPr>
+              <w:t>{</w:t>
+            </w:r>
+            <w:proofErr w:type="spellStart"/>
+            <w:r>
+              <w:rPr>
+                <w:rFonts w:ascii="Arial" w:hAnsi="Arial" w:cs="Arial"/>
+                <w:szCs w:val="24"/>
+              </w:rPr>
+              <w:t>Oferta.Direccion</w:t>
+            </w:r>
+            <w:proofErr w:type="spellEnd"/>
+            <w:r>
+              <w:rPr>
+                <w:rFonts w:ascii="Arial" w:hAnsi="Arial" w:cs="Arial"/>
+                <w:szCs w:val="24"/>
+              </w:rPr>
+              <w:t xml:space="preserve"> de Entrega}</w:t>
+            </w:r>
+          </w:p>
+        </w:tc>
+        <w:tc>
+          <w:tcPr>
+            <w:tcW w:w="5236" w:type="dxa"/>
+            <w:shd w:val="clear" w:color="auto" w:fill="auto"/>
+          </w:tcPr>
+          <w:p>
+            <w:pPr>
+              <w:widowControl/>
+              <w:rPr>
+                <w:rFonts w:ascii="Arial" w:hAnsi="Arial" w:cs="Arial"/>
+                <w:b/>
+                <w:bCs/>
+                <w:szCs w:val="24"/>
+                <w:highlight w:val="yellow"/>
+              </w:rPr>
+            </w:pPr>
+          </w:p>
+        </w:tc>
+        <w:tc>
+          <w:tcPr>
+            <w:tcW w:w="236" w:type="dxa"/>
+            <w:shd w:val="clear" w:color="auto" w:fill="auto"/>
+          </w:tcPr>
+          <w:p>
+            <w:pPr>
+              <w:widowControl/>
+              <w:rPr>
+                <w:rFonts w:ascii="Arial" w:hAnsi="Arial" w:cs="Arial"/>
+                <w:b/>
+                <w:bCs/>
+                <w:szCs w:val="24"/>
+                <w:highlight w:val="yellow"/>
+              </w:rPr>
+            </w:pPr>
+          </w:p>
+        </w:tc>
+      </w:tr>
+    </w:tbl>
     <w:p>
       <w:pPr>
         <w:widowControl/>
@@ -51,9 +141,23 @@
           <w:b/>
           <w:bCs/>
           <w:szCs w:val="24"/>
-          <w:highlight w:val="yellow"/>
-        </w:rPr>
-      </w:pPr>
+        </w:rPr>
+      </w:pPr>
+      <w:r>
+        <w:rPr>
+          <w:rFonts w:ascii="Arial" w:hAnsi="Arial" w:cs="Arial"/>
+          <w:i/>
+          <w:szCs w:val="24"/>
+        </w:rPr>
+        <w:t>A la atención de:</w:t>
+      </w:r>
+      <w:r>
+        <w:rPr>
+          <w:rFonts w:ascii="Arial" w:hAnsi="Arial" w:cs="Arial"/>
+          <w:szCs w:val="24"/>
+        </w:rPr>
+        <w:t xml:space="preserve"> </w:t>
+      </w:r>
       <w:r>
         <w:rPr>
           <w:rFonts w:ascii="Arial" w:hAnsi="Arial" w:cs="Arial"/>
@@ -71,7 +175,7 @@
           <w:bCs/>
           <w:szCs w:val="24"/>
         </w:rPr>
-        <w:t>Oferta.Direccion</w:t>
+        <w:t>Oferta.Persona</w:t>
       </w:r>
       <w:proofErr w:type="spellEnd"/>
       <w:r>
@@ -81,83 +185,8 @@
           <w:bCs/>
           <w:szCs w:val="24"/>
         </w:rPr>
-        <w:t xml:space="preserve"> de Entrega}</w:t>
-      </w:r>
-    </w:p>
-    <w:p>
-      <w:pPr>
-        <w:widowControl/>
-        <w:rPr>
-          <w:rFonts w:ascii="Arial" w:hAnsi="Arial" w:cs="Arial"/>
-          <w:i/>
-          <w:szCs w:val="24"/>
-          <w:highlight w:val="yellow"/>
-        </w:rPr>
-      </w:pPr>
-    </w:p>
-    <w:p>
-      <w:pPr>
-        <w:widowControl/>
-        <w:rPr>
-          <w:rFonts w:ascii="Arial" w:hAnsi="Arial" w:cs="Arial"/>
-          <w:b/>
-          <w:bCs/>
-          <w:szCs w:val="24"/>
-        </w:rPr>
-      </w:pPr>
-      <w:r>
-        <w:rPr>
-          <w:rFonts w:ascii="Arial" w:hAnsi="Arial" w:cs="Arial"/>
-          <w:i/>
-          <w:szCs w:val="24"/>
-        </w:rPr>
-        <w:t>A la atención de:</w:t>
-      </w:r>
-      <w:r>
-        <w:rPr>
-          <w:rFonts w:ascii="Arial" w:hAnsi="Arial" w:cs="Arial"/>
-          <w:szCs w:val="24"/>
-        </w:rPr>
-        <w:t xml:space="preserve"> </w:t>
-      </w:r>
-      <w:r>
-        <w:rPr>
-          <w:rFonts w:ascii="Arial" w:hAnsi="Arial" w:cs="Arial"/>
-          <w:b/>
-          <w:bCs/>
-          <w:szCs w:val="24"/>
-        </w:rPr>
-        <w:t>{</w:t>
-      </w:r>
-      <w:proofErr w:type="spellStart"/>
-      <w:r>
-        <w:rPr>
-          <w:rFonts w:ascii="Arial" w:hAnsi="Arial" w:cs="Arial"/>
-          <w:b/>
-          <w:bCs/>
-          <w:szCs w:val="24"/>
-        </w:rPr>
-        <w:t>Oferta.Persona</w:t>
-      </w:r>
-      <w:proofErr w:type="spellEnd"/>
-      <w:r>
-        <w:rPr>
-          <w:rFonts w:ascii="Arial" w:hAnsi="Arial" w:cs="Arial"/>
-          <w:b/>
-          <w:bCs/>
-          <w:szCs w:val="24"/>
-        </w:rPr>
         <w:t xml:space="preserve"> de Contacto}</w:t>
       </w:r>
-    </w:p>
-    <w:p>
-      <w:pPr>
-        <w:widowControl/>
-        <w:rPr>
-          <w:rFonts w:ascii="Arial" w:hAnsi="Arial" w:cs="Arial"/>
-          <w:szCs w:val="24"/>
-        </w:rPr>
-      </w:pPr>
     </w:p>
     <w:p>
       <w:pPr>
@@ -345,6 +374,7 @@
         <w:t>{</w:t>
       </w:r>
       <w:proofErr w:type="spellStart"/>
+      <w:proofErr w:type="gramStart"/>
       <w:r>
         <w:rPr>
           <w:rFonts w:ascii="Arial" w:hAnsi="Arial" w:cs="Arial"/>
@@ -355,6 +385,7 @@
         <w:t>Oferta.Cliente.Nombre</w:t>
       </w:r>
       <w:proofErr w:type="spellEnd"/>
+      <w:proofErr w:type="gramEnd"/>
       <w:r>
         <w:rPr>
           <w:rFonts w:ascii="Arial" w:hAnsi="Arial" w:cs="Arial"/>
@@ -698,6 +729,7 @@
         <w:t>{</w:t>
       </w:r>
       <w:proofErr w:type="spellStart"/>
+      <w:proofErr w:type="gramStart"/>
       <w:r>
         <w:rPr>
           <w:rFonts w:ascii="Arial" w:hAnsi="Arial" w:cs="Arial"/>
@@ -708,6 +740,7 @@
         <w:t>Oferta.Cliente.Nombre</w:t>
       </w:r>
       <w:proofErr w:type="spellEnd"/>
+      <w:proofErr w:type="gramEnd"/>
       <w:r>
         <w:rPr>
           <w:rFonts w:ascii="Arial" w:hAnsi="Arial" w:cs="Arial"/>
@@ -899,6 +932,7 @@
               <w:t xml:space="preserve"> </w:t>
             </w:r>
             <w:proofErr w:type="spellStart"/>
+            <w:proofErr w:type="gramStart"/>
             <w:r>
               <w:rPr>
                 <w:rFonts w:ascii="Arial" w:hAnsi="Arial" w:cs="Arial"/>
@@ -909,6 +943,7 @@
               <w:t>A.Telephone</w:t>
             </w:r>
             <w:proofErr w:type="spellEnd"/>
+            <w:proofErr w:type="gramEnd"/>
             <w:r>
               <w:rPr>
                 <w:rFonts w:ascii="Arial" w:hAnsi="Arial" w:cs="Arial"/>
@@ -974,6 +1009,7 @@
               <w:t xml:space="preserve"> </w:t>
             </w:r>
             <w:proofErr w:type="spellStart"/>
+            <w:proofErr w:type="gramStart"/>
             <w:r>
               <w:rPr>
                 <w:rFonts w:ascii="Arial" w:hAnsi="Arial" w:cs="Arial"/>
@@ -984,6 +1020,7 @@
               <w:t>A.Mobil</w:t>
             </w:r>
             <w:proofErr w:type="spellEnd"/>
+            <w:proofErr w:type="gramEnd"/>
             <w:r>
               <w:rPr>
                 <w:rFonts w:ascii="Arial" w:hAnsi="Arial" w:cs="Arial"/>
@@ -1017,6 +1054,7 @@
               <w:t>{</w:t>
             </w:r>
             <w:proofErr w:type="spellStart"/>
+            <w:proofErr w:type="gramStart"/>
             <w:r>
               <w:rPr>
                 <w:rFonts w:ascii="Arial" w:hAnsi="Arial" w:cs="Arial"/>
@@ -1027,6 +1065,7 @@
               <w:t>vendedor.email</w:t>
             </w:r>
             <w:proofErr w:type="spellEnd"/>
+            <w:proofErr w:type="gramEnd"/>
             <w:r>
               <w:rPr>
                 <w:rFonts w:ascii="Arial" w:hAnsi="Arial" w:cs="Arial"/>
@@ -1136,6 +1175,7 @@
               <w:t xml:space="preserve"> </w:t>
             </w:r>
             <w:proofErr w:type="spellStart"/>
+            <w:proofErr w:type="gramStart"/>
             <w:r>
               <w:rPr>
                 <w:rFonts w:ascii="Arial" w:hAnsi="Arial" w:cs="Arial"/>
@@ -1146,6 +1186,7 @@
               <w:t>A.Telephone</w:t>
             </w:r>
             <w:proofErr w:type="spellEnd"/>
+            <w:proofErr w:type="gramEnd"/>
             <w:r>
               <w:rPr>
                 <w:rFonts w:ascii="Arial" w:hAnsi="Arial" w:cs="Arial"/>
@@ -1210,6 +1251,7 @@
               <w:t xml:space="preserve"> </w:t>
             </w:r>
             <w:proofErr w:type="spellStart"/>
+            <w:proofErr w:type="gramStart"/>
             <w:r>
               <w:rPr>
                 <w:rFonts w:ascii="Arial" w:hAnsi="Arial" w:cs="Arial"/>
@@ -1220,6 +1262,7 @@
               <w:t>A.Mobil</w:t>
             </w:r>
             <w:proofErr w:type="spellEnd"/>
+            <w:proofErr w:type="gramEnd"/>
             <w:r>
               <w:rPr>
                 <w:rFonts w:ascii="Arial" w:hAnsi="Arial" w:cs="Arial"/>
@@ -1288,7 +1331,6 @@
           <w:sz w:val="32"/>
           <w:szCs w:val="32"/>
         </w:rPr>
-        <w:lastRenderedPageBreak/>
         <w:tab/>
       </w:r>
       <w:r>
@@ -1331,9 +1373,11 @@
           <w:bCs/>
           <w:szCs w:val="24"/>
         </w:rPr>
+        <w:lastRenderedPageBreak/>
         <w:t>{</w:t>
       </w:r>
       <w:proofErr w:type="spellStart"/>
+      <w:proofErr w:type="gramStart"/>
       <w:r>
         <w:rPr>
           <w:rFonts w:ascii="Arial" w:hAnsi="Arial" w:cs="Arial"/>
@@ -1344,6 +1388,7 @@
         <w:t>Oferta.Cliente.Nombre</w:t>
       </w:r>
       <w:proofErr w:type="spellEnd"/>
+      <w:proofErr w:type="gramEnd"/>
       <w:r>
         <w:rPr>
           <w:rFonts w:ascii="Arial" w:hAnsi="Arial" w:cs="Arial"/>
@@ -1656,6 +1701,7 @@
         <w:t xml:space="preserve"> </w:t>
       </w:r>
       <w:proofErr w:type="spellStart"/>
+      <w:proofErr w:type="gramStart"/>
       <w:r>
         <w:rPr>
           <w:rFonts w:ascii="Arial" w:hAnsi="Arial" w:cs="Arial"/>
@@ -1673,7 +1719,17 @@
           <w:bCs/>
           <w:szCs w:val="24"/>
         </w:rPr>
-        <w:t>}/{</w:t>
+        <w:t>}/</w:t>
+      </w:r>
+      <w:proofErr w:type="gramEnd"/>
+      <w:r>
+        <w:rPr>
+          <w:rFonts w:ascii="Arial" w:hAnsi="Arial" w:cs="Arial"/>
+          <w:b/>
+          <w:bCs/>
+          <w:szCs w:val="24"/>
+        </w:rPr>
+        <w:t>{</w:t>
       </w:r>
       <w:proofErr w:type="spellStart"/>
       <w:r>
@@ -2092,12 +2148,8 @@
       <w:pPr>
         <w:widowControl/>
         <w:sectPr>
-          <w:headerReference w:type="even" r:id="rId8"/>
-          <w:headerReference w:type="default" r:id="rId9"/>
-          <w:footerReference w:type="even" r:id="rId10"/>
-          <w:footerReference w:type="default" r:id="rId11"/>
-          <w:headerReference w:type="first" r:id="rId12"/>
-          <w:footerReference w:type="first" r:id="rId13"/>
+          <w:headerReference w:type="default" r:id="rId8"/>
+          <w:footerReference w:type="default" r:id="rId9"/>
           <w:endnotePr>
             <w:numFmt w:val="decimal"/>
           </w:endnotePr>
@@ -2801,13 +2853,27 @@
         <w:rPr>
           <w:rFonts w:ascii="Arial" w:hAnsi="Arial"/>
         </w:rPr>
-        <w:t>De las cuatro (4) u ocho (8) ruedas de traslación, la mitad son motrices,</w:t>
-      </w:r>
-      <w:r>
-        <w:rPr>
-          <w:rFonts w:ascii="Arial" w:hAnsi="Arial"/>
-        </w:rPr>
-        <w:t xml:space="preserve">                        </w:t>
+        <w:t xml:space="preserve">De las cuatro (4) u ocho (8) ruedas de traslación, la mitad son </w:t>
+      </w:r>
+      <w:proofErr w:type="gramStart"/>
+      <w:r>
+        <w:rPr>
+          <w:rFonts w:ascii="Arial" w:hAnsi="Arial"/>
+        </w:rPr>
+        <w:t>motrices,</w:t>
+      </w:r>
+      <w:r>
+        <w:rPr>
+          <w:rFonts w:ascii="Arial" w:hAnsi="Arial"/>
+        </w:rPr>
+        <w:t xml:space="preserve">   </w:t>
+      </w:r>
+      <w:proofErr w:type="gramEnd"/>
+      <w:r>
+        <w:rPr>
+          <w:rFonts w:ascii="Arial" w:hAnsi="Arial"/>
+        </w:rPr>
+        <w:t xml:space="preserve">                     </w:t>
       </w:r>
       <w:r>
         <w:rPr>
@@ -3286,6 +3352,7 @@
         <w:t>{</w:t>
       </w:r>
       <w:proofErr w:type="spellStart"/>
+      <w:proofErr w:type="gramStart"/>
       <w:r>
         <w:rPr>
           <w:rFonts w:ascii="Arial" w:hAnsi="Arial"/>
@@ -3303,6 +3370,7 @@
         <w:t>Carro</w:t>
       </w:r>
       <w:proofErr w:type="spellEnd"/>
+      <w:proofErr w:type="gramEnd"/>
       <w:r>
         <w:rPr>
           <w:rFonts w:ascii="Arial" w:hAnsi="Arial"/>
@@ -3854,6 +3922,7 @@
         <w:t>{</w:t>
       </w:r>
       <w:proofErr w:type="spellStart"/>
+      <w:proofErr w:type="gramStart"/>
       <w:r>
         <w:rPr>
           <w:rFonts w:ascii="Arial" w:hAnsi="Arial"/>
@@ -3887,6 +3956,7 @@
         <w:t>Gancho</w:t>
       </w:r>
       <w:proofErr w:type="spellEnd"/>
+      <w:proofErr w:type="gramEnd"/>
       <w:r>
         <w:rPr>
           <w:rFonts w:ascii="Arial" w:hAnsi="Arial"/>
@@ -4030,6 +4100,7 @@
         <w:t>{</w:t>
       </w:r>
       <w:proofErr w:type="spellStart"/>
+      <w:proofErr w:type="gramStart"/>
       <w:r>
         <w:rPr>
           <w:rFonts w:ascii="Arial" w:hAnsi="Arial"/>
@@ -4047,6 +4118,7 @@
         <w:t>Carro</w:t>
       </w:r>
       <w:proofErr w:type="spellEnd"/>
+      <w:proofErr w:type="gramEnd"/>
       <w:r>
         <w:rPr>
           <w:rFonts w:ascii="Arial" w:hAnsi="Arial"/>
@@ -4152,6 +4224,7 @@
         <w:t>{</w:t>
       </w:r>
       <w:proofErr w:type="spellStart"/>
+      <w:proofErr w:type="gramStart"/>
       <w:r>
         <w:rPr>
           <w:rFonts w:ascii="Arial" w:hAnsi="Arial"/>
@@ -4169,6 +4242,7 @@
         <w:t>Puente.Control</w:t>
       </w:r>
       <w:proofErr w:type="spellEnd"/>
+      <w:proofErr w:type="gramEnd"/>
       <w:r>
         <w:rPr>
           <w:rFonts w:ascii="Arial" w:hAnsi="Arial"/>
@@ -4631,6 +4705,7 @@
         <w:t>{</w:t>
       </w:r>
       <w:proofErr w:type="spellStart"/>
+      <w:proofErr w:type="gramStart"/>
       <w:r>
         <w:rPr>
           <w:rFonts w:ascii="Arial" w:hAnsi="Arial"/>
@@ -4640,6 +4715,7 @@
         <w:t>Oferta.Cliente.Nombre</w:t>
       </w:r>
       <w:proofErr w:type="spellEnd"/>
+      <w:proofErr w:type="gramEnd"/>
       <w:r>
         <w:rPr>
           <w:rFonts w:ascii="Arial" w:hAnsi="Arial"/>
@@ -4689,7 +4765,7 @@
     <w:p>
       <w:pPr>
         <w:sectPr>
-          <w:headerReference w:type="default" r:id="rId14"/>
+          <w:headerReference w:type="default" r:id="rId10"/>
           <w:endnotePr>
             <w:numFmt w:val="decimal"/>
           </w:endnotePr>
@@ -4922,8 +4998,9 @@
                 <w:spacing w:val="-4"/>
                 <w:szCs w:val="24"/>
               </w:rPr>
-              <w:t>. Capacidad de la(s) grúa(s)</w:t>
-            </w:r>
+              <w:t>. Capacidad de la(s) grúa(s</w:t>
+            </w:r>
+            <w:proofErr w:type="gramStart"/>
             <w:r>
               <w:rPr>
                 <w:rFonts w:ascii="Arial Black" w:hAnsi="Arial Black" w:cs="Arial"/>
@@ -4932,8 +5009,19 @@
                 <w:spacing w:val="-4"/>
                 <w:szCs w:val="24"/>
               </w:rPr>
+              <w:t>)</w:t>
+            </w:r>
+            <w:r>
+              <w:rPr>
+                <w:rFonts w:ascii="Arial Black" w:hAnsi="Arial Black" w:cs="Arial"/>
+                <w:b/>
+                <w:color w:val="1F497D"/>
+                <w:spacing w:val="-4"/>
+                <w:szCs w:val="24"/>
+              </w:rPr>
               <w:t>.toneladas</w:t>
             </w:r>
+            <w:proofErr w:type="gramEnd"/>
             <w:r>
               <w:rPr>
                 <w:rFonts w:ascii="Arial Black" w:hAnsi="Arial Black" w:cs="Arial"/>
@@ -5103,7 +5191,21 @@
                 <w:rFonts w:ascii="Arial" w:hAnsi="Arial"/>
               </w:rPr>
               <w:tab/>
-              <w:t xml:space="preserve">      : </w:t>
+              <w:t xml:space="preserve">    </w:t>
+            </w:r>
+            <w:proofErr w:type="gramStart"/>
+            <w:r>
+              <w:rPr>
+                <w:rFonts w:ascii="Arial" w:hAnsi="Arial"/>
+              </w:rPr>
+              <w:t xml:space="preserve">  :</w:t>
+            </w:r>
+            <w:proofErr w:type="gramEnd"/>
+            <w:r>
+              <w:rPr>
+                <w:rFonts w:ascii="Arial" w:hAnsi="Arial"/>
+              </w:rPr>
+              <w:t xml:space="preserve"> </w:t>
             </w:r>
             <w:r>
               <w:rPr>
@@ -5203,7 +5305,21 @@
                 <w:rFonts w:ascii="Arial" w:hAnsi="Arial"/>
               </w:rPr>
               <w:tab/>
-              <w:t xml:space="preserve">      : </w:t>
+              <w:t xml:space="preserve">    </w:t>
+            </w:r>
+            <w:proofErr w:type="gramStart"/>
+            <w:r>
+              <w:rPr>
+                <w:rFonts w:ascii="Arial" w:hAnsi="Arial"/>
+              </w:rPr>
+              <w:t xml:space="preserve">  :</w:t>
+            </w:r>
+            <w:proofErr w:type="gramEnd"/>
+            <w:r>
+              <w:rPr>
+                <w:rFonts w:ascii="Arial" w:hAnsi="Arial"/>
+              </w:rPr>
+              <w:t xml:space="preserve"> </w:t>
             </w:r>
             <w:r>
               <w:rPr>
@@ -5283,7 +5399,21 @@
                 <w:rFonts w:ascii="Arial" w:hAnsi="Arial"/>
               </w:rPr>
               <w:tab/>
-              <w:t xml:space="preserve">      : </w:t>
+              <w:t xml:space="preserve">    </w:t>
+            </w:r>
+            <w:proofErr w:type="gramStart"/>
+            <w:r>
+              <w:rPr>
+                <w:rFonts w:ascii="Arial" w:hAnsi="Arial"/>
+              </w:rPr>
+              <w:t xml:space="preserve">  :</w:t>
+            </w:r>
+            <w:proofErr w:type="gramEnd"/>
+            <w:r>
+              <w:rPr>
+                <w:rFonts w:ascii="Arial" w:hAnsi="Arial"/>
+              </w:rPr>
+              <w:t xml:space="preserve"> </w:t>
             </w:r>
             <w:r>
               <w:rPr>
@@ -5368,13 +5498,27 @@
               <w:rPr>
                 <w:rFonts w:ascii="Arial" w:hAnsi="Arial"/>
               </w:rPr>
-              <w:t xml:space="preserve">        </w:t>
-            </w:r>
-            <w:r>
-              <w:rPr>
-                <w:rFonts w:ascii="Arial" w:hAnsi="Arial"/>
-              </w:rPr>
-              <w:t xml:space="preserve">: </w:t>
+              <w:t xml:space="preserve">      </w:t>
+            </w:r>
+            <w:proofErr w:type="gramStart"/>
+            <w:r>
+              <w:rPr>
+                <w:rFonts w:ascii="Arial" w:hAnsi="Arial"/>
+              </w:rPr>
+              <w:t xml:space="preserve">  </w:t>
+            </w:r>
+            <w:r>
+              <w:rPr>
+                <w:rFonts w:ascii="Arial" w:hAnsi="Arial"/>
+              </w:rPr>
+              <w:t>:</w:t>
+            </w:r>
+            <w:proofErr w:type="gramEnd"/>
+            <w:r>
+              <w:rPr>
+                <w:rFonts w:ascii="Arial" w:hAnsi="Arial"/>
+              </w:rPr>
+              <w:t xml:space="preserve"> </w:t>
             </w:r>
             <w:r>
               <w:rPr>
@@ -5519,13 +5663,27 @@
               <w:rPr>
                 <w:rFonts w:ascii="Arial" w:hAnsi="Arial"/>
               </w:rPr>
-              <w:t xml:space="preserve">    </w:t>
-            </w:r>
-            <w:r>
-              <w:rPr>
-                <w:rFonts w:ascii="Arial" w:hAnsi="Arial"/>
-              </w:rPr>
-              <w:t xml:space="preserve">: </w:t>
+              <w:t xml:space="preserve">  </w:t>
+            </w:r>
+            <w:proofErr w:type="gramStart"/>
+            <w:r>
+              <w:rPr>
+                <w:rFonts w:ascii="Arial" w:hAnsi="Arial"/>
+              </w:rPr>
+              <w:t xml:space="preserve">  </w:t>
+            </w:r>
+            <w:r>
+              <w:rPr>
+                <w:rFonts w:ascii="Arial" w:hAnsi="Arial"/>
+              </w:rPr>
+              <w:t>:</w:t>
+            </w:r>
+            <w:proofErr w:type="gramEnd"/>
+            <w:r>
+              <w:rPr>
+                <w:rFonts w:ascii="Arial" w:hAnsi="Arial"/>
+              </w:rPr>
+              <w:t xml:space="preserve"> </w:t>
             </w:r>
             <w:r>
               <w:rPr>
@@ -5646,13 +5804,27 @@
               <w:rPr>
                 <w:rFonts w:ascii="Arial" w:hAnsi="Arial"/>
               </w:rPr>
-              <w:t xml:space="preserve">    </w:t>
-            </w:r>
-            <w:r>
-              <w:rPr>
-                <w:rFonts w:ascii="Arial" w:hAnsi="Arial"/>
-              </w:rPr>
-              <w:t xml:space="preserve">: </w:t>
+              <w:t xml:space="preserve">  </w:t>
+            </w:r>
+            <w:proofErr w:type="gramStart"/>
+            <w:r>
+              <w:rPr>
+                <w:rFonts w:ascii="Arial" w:hAnsi="Arial"/>
+              </w:rPr>
+              <w:t xml:space="preserve">  </w:t>
+            </w:r>
+            <w:r>
+              <w:rPr>
+                <w:rFonts w:ascii="Arial" w:hAnsi="Arial"/>
+              </w:rPr>
+              <w:t>:</w:t>
+            </w:r>
+            <w:proofErr w:type="gramEnd"/>
+            <w:r>
+              <w:rPr>
+                <w:rFonts w:ascii="Arial" w:hAnsi="Arial"/>
+              </w:rPr>
+              <w:t xml:space="preserve"> </w:t>
             </w:r>
             <w:r>
               <w:rPr>
@@ -5751,13 +5923,27 @@
               <w:rPr>
                 <w:rFonts w:ascii="Arial" w:hAnsi="Arial"/>
               </w:rPr>
-              <w:t xml:space="preserve">tidad de carros               </w:t>
-            </w:r>
-            <w:r>
-              <w:rPr>
-                <w:rFonts w:ascii="Arial" w:hAnsi="Arial"/>
-              </w:rPr>
-              <w:t xml:space="preserve">: </w:t>
+              <w:t xml:space="preserve">tidad de carros             </w:t>
+            </w:r>
+            <w:proofErr w:type="gramStart"/>
+            <w:r>
+              <w:rPr>
+                <w:rFonts w:ascii="Arial" w:hAnsi="Arial"/>
+              </w:rPr>
+              <w:t xml:space="preserve">  </w:t>
+            </w:r>
+            <w:r>
+              <w:rPr>
+                <w:rFonts w:ascii="Arial" w:hAnsi="Arial"/>
+              </w:rPr>
+              <w:t>:</w:t>
+            </w:r>
+            <w:proofErr w:type="gramEnd"/>
+            <w:r>
+              <w:rPr>
+                <w:rFonts w:ascii="Arial" w:hAnsi="Arial"/>
+              </w:rPr>
+              <w:t xml:space="preserve"> </w:t>
             </w:r>
             <w:r>
               <w:rPr>
@@ -5850,7 +6036,21 @@
               <w:rPr>
                 <w:rFonts w:ascii="Arial" w:hAnsi="Arial"/>
               </w:rPr>
-              <w:t xml:space="preserve">Modelo del gancho principal         : </w:t>
+              <w:t xml:space="preserve">Modelo del gancho principal       </w:t>
+            </w:r>
+            <w:proofErr w:type="gramStart"/>
+            <w:r>
+              <w:rPr>
+                <w:rFonts w:ascii="Arial" w:hAnsi="Arial"/>
+              </w:rPr>
+              <w:t xml:space="preserve">  :</w:t>
+            </w:r>
+            <w:proofErr w:type="gramEnd"/>
+            <w:r>
+              <w:rPr>
+                <w:rFonts w:ascii="Arial" w:hAnsi="Arial"/>
+              </w:rPr>
+              <w:t xml:space="preserve"> </w:t>
             </w:r>
             <w:r>
               <w:rPr>
@@ -5980,7 +6180,21 @@
               <w:rPr>
                 <w:rFonts w:ascii="Arial" w:hAnsi="Arial" w:cs="Arial"/>
               </w:rPr>
-              <w:t xml:space="preserve">     : </w:t>
+              <w:t xml:space="preserve">   </w:t>
+            </w:r>
+            <w:proofErr w:type="gramStart"/>
+            <w:r>
+              <w:rPr>
+                <w:rFonts w:ascii="Arial" w:hAnsi="Arial" w:cs="Arial"/>
+              </w:rPr>
+              <w:t xml:space="preserve">  :</w:t>
+            </w:r>
+            <w:proofErr w:type="gramEnd"/>
+            <w:r>
+              <w:rPr>
+                <w:rFonts w:ascii="Arial" w:hAnsi="Arial" w:cs="Arial"/>
+              </w:rPr>
+              <w:t xml:space="preserve"> </w:t>
             </w:r>
             <w:r>
               <w:rPr>
@@ -6041,7 +6255,7 @@
       </w:tr>
       <w:tr>
         <w:trPr>
-          <w:trHeight w:val="546"/>
+          <w:trHeight w:val="835"/>
         </w:trPr>
         <w:tc>
           <w:tcPr>
@@ -6050,10 +6264,28 @@
           </w:tcPr>
           <w:p>
             <w:pPr>
+              <w:numPr>
+                <w:ilvl w:val="0"/>
+                <w:numId w:val="18"/>
+              </w:numPr>
               <w:rPr>
                 <w:rFonts w:ascii="Arial" w:hAnsi="Arial" w:cs="Arial"/>
               </w:rPr>
             </w:pPr>
+            <w:proofErr w:type="spellStart"/>
+            <w:r>
+              <w:rPr>
+                <w:rFonts w:ascii="Arial" w:hAnsi="Arial"/>
+              </w:rPr>
+              <w:t>Izaje</w:t>
+            </w:r>
+            <w:proofErr w:type="spellEnd"/>
+            <w:r>
+              <w:rPr>
+                <w:rFonts w:ascii="Arial" w:hAnsi="Arial"/>
+              </w:rPr>
+              <w:t xml:space="preserve">: </w:t>
+            </w:r>
             <w:r>
               <w:rPr>
                 <w:rFonts w:ascii="Arial" w:hAnsi="Arial" w:cs="Arial"/>
@@ -6061,6 +6293,7 @@
               <w:t>{</w:t>
             </w:r>
             <w:proofErr w:type="spellStart"/>
+            <w:proofErr w:type="gramStart"/>
             <w:r>
               <w:rPr>
                 <w:rFonts w:ascii="Arial" w:hAnsi="Arial" w:cs="Arial"/>
@@ -6073,6 +6306,19 @@
                 <w:rFonts w:ascii="Arial" w:hAnsi="Arial" w:cs="Arial"/>
               </w:rPr>
               <w:t>}</w:t>
+            </w:r>
+            <w:r>
+              <w:rPr>
+                <w:rFonts w:ascii="Arial" w:hAnsi="Arial"/>
+              </w:rPr>
+              <w:t xml:space="preserve">   </w:t>
+            </w:r>
+            <w:proofErr w:type="gramEnd"/>
+            <w:r>
+              <w:rPr>
+                <w:rFonts w:ascii="Arial" w:hAnsi="Arial"/>
+              </w:rPr>
+              <w:t xml:space="preserve">   </w:t>
             </w:r>
           </w:p>
         </w:tc>
@@ -6102,7 +6348,21 @@
               <w:rPr>
                 <w:rFonts w:ascii="Arial" w:hAnsi="Arial"/>
               </w:rPr>
-              <w:t xml:space="preserve">Velocidad de elevación con gancho               : Control de velocidad continuo de </w:t>
+              <w:t xml:space="preserve">Velocidad de elevación con gancho             </w:t>
+            </w:r>
+            <w:proofErr w:type="gramStart"/>
+            <w:r>
+              <w:rPr>
+                <w:rFonts w:ascii="Arial" w:hAnsi="Arial"/>
+              </w:rPr>
+              <w:t xml:space="preserve">  :</w:t>
+            </w:r>
+            <w:proofErr w:type="gramEnd"/>
+            <w:r>
+              <w:rPr>
+                <w:rFonts w:ascii="Arial" w:hAnsi="Arial"/>
+              </w:rPr>
+              <w:t xml:space="preserve"> Control de velocidad continuo de </w:t>
             </w:r>
             <w:r>
               <w:rPr>
@@ -6209,7 +6469,21 @@
               <w:rPr>
                 <w:rFonts w:ascii="Arial" w:hAnsi="Arial"/>
               </w:rPr>
-              <w:t xml:space="preserve">Motor/modelo del gancho             : </w:t>
+              <w:t xml:space="preserve">Motor/modelo del gancho           </w:t>
+            </w:r>
+            <w:proofErr w:type="gramStart"/>
+            <w:r>
+              <w:rPr>
+                <w:rFonts w:ascii="Arial" w:hAnsi="Arial"/>
+              </w:rPr>
+              <w:t xml:space="preserve">  :</w:t>
+            </w:r>
+            <w:proofErr w:type="gramEnd"/>
+            <w:r>
+              <w:rPr>
+                <w:rFonts w:ascii="Arial" w:hAnsi="Arial"/>
+              </w:rPr>
+              <w:t xml:space="preserve"> </w:t>
             </w:r>
             <w:r>
               <w:rPr>
@@ -6394,7 +6668,21 @@
               <w:rPr>
                 <w:rFonts w:ascii="Arial" w:hAnsi="Arial"/>
               </w:rPr>
-              <w:t xml:space="preserve">Potencia/motor de elevación del gancho   : </w:t>
+              <w:t xml:space="preserve">Potencia/motor de elevación del gancho </w:t>
+            </w:r>
+            <w:proofErr w:type="gramStart"/>
+            <w:r>
+              <w:rPr>
+                <w:rFonts w:ascii="Arial" w:hAnsi="Arial"/>
+              </w:rPr>
+              <w:t xml:space="preserve">  :</w:t>
+            </w:r>
+            <w:proofErr w:type="gramEnd"/>
+            <w:r>
+              <w:rPr>
+                <w:rFonts w:ascii="Arial" w:hAnsi="Arial"/>
+              </w:rPr>
+              <w:t xml:space="preserve"> </w:t>
             </w:r>
             <w:r>
               <w:rPr>
@@ -6494,6 +6782,7 @@
               <w:rPr>
                 <w:rFonts w:ascii="Arial" w:hAnsi="Arial"/>
               </w:rPr>
+              <w:lastRenderedPageBreak/>
               <w:t>Clasificación</w:t>
             </w:r>
             <w:r>
@@ -6501,7 +6790,21 @@
                 <w:rFonts w:ascii="Arial" w:hAnsi="Arial"/>
               </w:rPr>
               <w:tab/>
-              <w:t xml:space="preserve">                : </w:t>
+              <w:t xml:space="preserve">              </w:t>
+            </w:r>
+            <w:proofErr w:type="gramStart"/>
+            <w:r>
+              <w:rPr>
+                <w:rFonts w:ascii="Arial" w:hAnsi="Arial"/>
+              </w:rPr>
+              <w:t xml:space="preserve">  :</w:t>
+            </w:r>
+            <w:proofErr w:type="gramEnd"/>
+            <w:r>
+              <w:rPr>
+                <w:rFonts w:ascii="Arial" w:hAnsi="Arial"/>
+              </w:rPr>
+              <w:t xml:space="preserve"> </w:t>
             </w:r>
             <w:r>
               <w:rPr>
@@ -6538,8 +6841,16 @@
               <w:rPr>
                 <w:rFonts w:ascii="Arial" w:hAnsi="Arial"/>
               </w:rPr>
-              <w:t>Número de caídas de cuerda del gancho principal      :</w:t>
-            </w:r>
+              <w:t xml:space="preserve">Número de caídas de cuerda del gancho principal    </w:t>
+            </w:r>
+            <w:proofErr w:type="gramStart"/>
+            <w:r>
+              <w:rPr>
+                <w:rFonts w:ascii="Arial" w:hAnsi="Arial"/>
+              </w:rPr>
+              <w:t xml:space="preserve">  :</w:t>
+            </w:r>
+            <w:proofErr w:type="gramEnd"/>
             <w:r>
               <w:rPr>
                 <w:rFonts w:ascii="Arial" w:hAnsi="Arial" w:cs="Arial"/>
@@ -6611,7 +6922,6 @@
               <w:rPr>
                 <w:rFonts w:ascii="Arial" w:hAnsi="Arial"/>
               </w:rPr>
-              <w:lastRenderedPageBreak/>
               <w:t>Lo</w:t>
             </w:r>
             <w:r>
@@ -6711,7 +7021,21 @@
               <w:rPr>
                 <w:rFonts w:ascii="Arial" w:hAnsi="Arial"/>
               </w:rPr>
-              <w:t xml:space="preserve">Cantidad de carros                 : </w:t>
+              <w:t xml:space="preserve">Cantidad de carros               </w:t>
+            </w:r>
+            <w:proofErr w:type="gramStart"/>
+            <w:r>
+              <w:rPr>
+                <w:rFonts w:ascii="Arial" w:hAnsi="Arial"/>
+              </w:rPr>
+              <w:t xml:space="preserve">  :</w:t>
+            </w:r>
+            <w:proofErr w:type="gramEnd"/>
+            <w:r>
+              <w:rPr>
+                <w:rFonts w:ascii="Arial" w:hAnsi="Arial"/>
+              </w:rPr>
+              <w:t xml:space="preserve"> </w:t>
             </w:r>
             <w:r>
               <w:rPr>
@@ -6764,13 +7088,27 @@
               <w:rPr>
                 <w:rFonts w:ascii="Arial" w:hAnsi="Arial"/>
               </w:rPr>
-              <w:t xml:space="preserve">                </w:t>
-            </w:r>
-            <w:r>
-              <w:rPr>
-                <w:rFonts w:ascii="Arial" w:hAnsi="Arial"/>
-              </w:rPr>
-              <w:t xml:space="preserve">: </w:t>
+              <w:t xml:space="preserve">              </w:t>
+            </w:r>
+            <w:proofErr w:type="gramStart"/>
+            <w:r>
+              <w:rPr>
+                <w:rFonts w:ascii="Arial" w:hAnsi="Arial"/>
+              </w:rPr>
+              <w:t xml:space="preserve">  </w:t>
+            </w:r>
+            <w:r>
+              <w:rPr>
+                <w:rFonts w:ascii="Arial" w:hAnsi="Arial"/>
+              </w:rPr>
+              <w:t>:</w:t>
+            </w:r>
+            <w:proofErr w:type="gramEnd"/>
+            <w:r>
+              <w:rPr>
+                <w:rFonts w:ascii="Arial" w:hAnsi="Arial"/>
+              </w:rPr>
+              <w:t xml:space="preserve"> </w:t>
             </w:r>
             <w:r>
               <w:rPr>
@@ -6852,6 +7190,7 @@
               </w:rPr>
               <w:t xml:space="preserve">Diámetro de las ruedas del carro: </w:t>
             </w:r>
+            <w:proofErr w:type="gramStart"/>
             <w:r>
               <w:rPr>
                 <w:rFonts w:ascii="Arial" w:hAnsi="Arial"/>
@@ -6866,7 +7205,14 @@
               <w:rPr>
                 <w:rFonts w:ascii="Arial" w:hAnsi="Arial"/>
               </w:rPr>
-              <w:t>ArticuloDefiniciones.Carro.Carro</w:t>
+              <w:t>ArticuloDefiniciones.Carro</w:t>
+            </w:r>
+            <w:proofErr w:type="gramEnd"/>
+            <w:r>
+              <w:rPr>
+                <w:rFonts w:ascii="Arial" w:hAnsi="Arial"/>
+              </w:rPr>
+              <w:t>.Carro</w:t>
             </w:r>
             <w:proofErr w:type="spellEnd"/>
             <w:r>
@@ -6970,6 +7316,7 @@
               </w:rPr>
               <w:t xml:space="preserve">Material de la </w:t>
             </w:r>
+            <w:proofErr w:type="gramStart"/>
             <w:r>
               <w:rPr>
                 <w:rFonts w:ascii="Arial" w:hAnsi="Arial"/>
@@ -6980,7 +7327,14 @@
               <w:rPr>
                 <w:rFonts w:ascii="Arial" w:hAnsi="Arial"/>
               </w:rPr>
-              <w:t xml:space="preserve">: </w:t>
+              <w:t>:</w:t>
+            </w:r>
+            <w:proofErr w:type="gramEnd"/>
+            <w:r>
+              <w:rPr>
+                <w:rFonts w:ascii="Arial" w:hAnsi="Arial"/>
+              </w:rPr>
+              <w:t xml:space="preserve"> </w:t>
             </w:r>
             <w:r>
               <w:rPr>
@@ -7040,7 +7394,21 @@
               <w:rPr>
                 <w:rFonts w:ascii="Arial" w:hAnsi="Arial"/>
               </w:rPr>
-              <w:t xml:space="preserve">Reductor del carro                              : </w:t>
+              <w:t xml:space="preserve">Reductor del carro                            </w:t>
+            </w:r>
+            <w:proofErr w:type="gramStart"/>
+            <w:r>
+              <w:rPr>
+                <w:rFonts w:ascii="Arial" w:hAnsi="Arial"/>
+              </w:rPr>
+              <w:t xml:space="preserve">  :</w:t>
+            </w:r>
+            <w:proofErr w:type="gramEnd"/>
+            <w:r>
+              <w:rPr>
+                <w:rFonts w:ascii="Arial" w:hAnsi="Arial"/>
+              </w:rPr>
+              <w:t xml:space="preserve"> </w:t>
             </w:r>
             <w:r>
               <w:rPr>
@@ -7140,13 +7508,27 @@
               <w:rPr>
                 <w:rFonts w:ascii="Arial" w:hAnsi="Arial"/>
               </w:rPr>
-              <w:t xml:space="preserve">   </w:t>
-            </w:r>
-            <w:r>
-              <w:rPr>
-                <w:rFonts w:ascii="Arial" w:hAnsi="Arial"/>
-              </w:rPr>
-              <w:t xml:space="preserve">:  </w:t>
+              <w:t xml:space="preserve"> </w:t>
+            </w:r>
+            <w:proofErr w:type="gramStart"/>
+            <w:r>
+              <w:rPr>
+                <w:rFonts w:ascii="Arial" w:hAnsi="Arial"/>
+              </w:rPr>
+              <w:t xml:space="preserve">  </w:t>
+            </w:r>
+            <w:r>
+              <w:rPr>
+                <w:rFonts w:ascii="Arial" w:hAnsi="Arial"/>
+              </w:rPr>
+              <w:t>:</w:t>
+            </w:r>
+            <w:proofErr w:type="gramEnd"/>
+            <w:r>
+              <w:rPr>
+                <w:rFonts w:ascii="Arial" w:hAnsi="Arial"/>
+              </w:rPr>
+              <w:t xml:space="preserve">  </w:t>
             </w:r>
             <w:r>
               <w:rPr>
@@ -7246,8 +7628,9 @@
               <w:rPr>
                 <w:rFonts w:ascii="Arial" w:hAnsi="Arial"/>
               </w:rPr>
-              <w:t xml:space="preserve"> del carro                    </w:t>
-            </w:r>
+              <w:t xml:space="preserve"> del carro                   </w:t>
+            </w:r>
+            <w:proofErr w:type="gramStart"/>
             <w:r>
               <w:rPr>
                 <w:rFonts w:ascii="Arial" w:hAnsi="Arial"/>
@@ -7258,7 +7641,20 @@
               <w:rPr>
                 <w:rFonts w:ascii="Arial" w:hAnsi="Arial"/>
               </w:rPr>
-              <w:t xml:space="preserve">:  </w:t>
+              <w:t xml:space="preserve"> </w:t>
+            </w:r>
+            <w:r>
+              <w:rPr>
+                <w:rFonts w:ascii="Arial" w:hAnsi="Arial"/>
+              </w:rPr>
+              <w:t>:</w:t>
+            </w:r>
+            <w:proofErr w:type="gramEnd"/>
+            <w:r>
+              <w:rPr>
+                <w:rFonts w:ascii="Arial" w:hAnsi="Arial"/>
+              </w:rPr>
+              <w:t xml:space="preserve">  </w:t>
             </w:r>
             <w:r>
               <w:rPr>
@@ -7291,44 +7687,6 @@
                 <w:rFonts w:ascii="Arial" w:hAnsi="Arial"/>
               </w:rPr>
               <w:t>{etiquetaPotenciaCarro1}</w:t>
-            </w:r>
-          </w:p>
-        </w:tc>
-      </w:tr>
-      <w:tr>
-        <w:trPr>
-          <w:trHeight w:val="568"/>
-        </w:trPr>
-        <w:tc>
-          <w:tcPr>
-            <w:tcW w:w="10702" w:type="dxa"/>
-            <w:vAlign w:val="center"/>
-          </w:tcPr>
-          <w:p>
-            <w:pPr>
-              <w:rPr>
-                <w:rFonts w:ascii="Arial" w:hAnsi="Arial" w:cs="Arial"/>
-              </w:rPr>
-            </w:pPr>
-            <w:r>
-              <w:rPr>
-                <w:rFonts w:ascii="Arial" w:hAnsi="Arial" w:cs="Arial"/>
-              </w:rPr>
-              <w:t>{</w:t>
-            </w:r>
-            <w:proofErr w:type="spellStart"/>
-            <w:r>
-              <w:rPr>
-                <w:rFonts w:ascii="Arial" w:hAnsi="Arial" w:cs="Arial"/>
-              </w:rPr>
-              <w:t>etiquetaTopeHidraulicoCarro</w:t>
-            </w:r>
-            <w:proofErr w:type="spellEnd"/>
-            <w:r>
-              <w:rPr>
-                <w:rFonts w:ascii="Arial" w:hAnsi="Arial" w:cs="Arial"/>
-              </w:rPr>
-              <w:t>}</w:t>
             </w:r>
           </w:p>
         </w:tc>
@@ -7357,6 +7715,83 @@
               <w:rPr>
                 <w:rFonts w:ascii="Arial" w:hAnsi="Arial"/>
               </w:rPr>
+              <w:t xml:space="preserve">Tope </w:t>
+            </w:r>
+            <w:proofErr w:type="spellStart"/>
+            <w:r>
+              <w:rPr>
+                <w:rFonts w:ascii="Arial" w:hAnsi="Arial"/>
+              </w:rPr>
+              <w:t>Hidraulico</w:t>
+            </w:r>
+            <w:proofErr w:type="spellEnd"/>
+            <w:r>
+              <w:rPr>
+                <w:rFonts w:ascii="Arial" w:hAnsi="Arial"/>
+              </w:rPr>
+              <w:t xml:space="preserve">: </w:t>
+            </w:r>
+            <w:r>
+              <w:rPr>
+                <w:rFonts w:ascii="Arial" w:hAnsi="Arial" w:cs="Arial"/>
+              </w:rPr>
+              <w:t>{</w:t>
+            </w:r>
+            <w:proofErr w:type="spellStart"/>
+            <w:proofErr w:type="gramStart"/>
+            <w:r>
+              <w:rPr>
+                <w:rFonts w:ascii="Arial" w:hAnsi="Arial" w:cs="Arial"/>
+              </w:rPr>
+              <w:t>etiquetaTopeHidraulicoCarro</w:t>
+            </w:r>
+            <w:proofErr w:type="spellEnd"/>
+            <w:r>
+              <w:rPr>
+                <w:rFonts w:ascii="Arial" w:hAnsi="Arial" w:cs="Arial"/>
+              </w:rPr>
+              <w:t>}</w:t>
+            </w:r>
+            <w:r>
+              <w:rPr>
+                <w:rFonts w:ascii="Arial" w:hAnsi="Arial"/>
+              </w:rPr>
+              <w:t xml:space="preserve">   </w:t>
+            </w:r>
+            <w:proofErr w:type="gramEnd"/>
+            <w:r>
+              <w:rPr>
+                <w:rFonts w:ascii="Arial" w:hAnsi="Arial"/>
+              </w:rPr>
+              <w:t xml:space="preserve">               </w:t>
+            </w:r>
+          </w:p>
+        </w:tc>
+      </w:tr>
+      <w:tr>
+        <w:trPr>
+          <w:trHeight w:val="832"/>
+        </w:trPr>
+        <w:tc>
+          <w:tcPr>
+            <w:tcW w:w="10702" w:type="dxa"/>
+            <w:vAlign w:val="center"/>
+          </w:tcPr>
+          <w:p>
+            <w:pPr>
+              <w:numPr>
+                <w:ilvl w:val="0"/>
+                <w:numId w:val="1"/>
+              </w:numPr>
+              <w:ind w:left="283"/>
+              <w:rPr>
+                <w:rFonts w:ascii="Arial" w:hAnsi="Arial" w:cs="Arial"/>
+              </w:rPr>
+            </w:pPr>
+            <w:r>
+              <w:rPr>
+                <w:rFonts w:ascii="Arial" w:hAnsi="Arial"/>
+              </w:rPr>
               <w:t>Velocidad de</w:t>
             </w:r>
             <w:r>
@@ -7388,13 +7823,27 @@
               <w:rPr>
                 <w:rFonts w:ascii="Arial" w:hAnsi="Arial"/>
               </w:rPr>
-              <w:t xml:space="preserve">       </w:t>
-            </w:r>
-            <w:r>
-              <w:rPr>
-                <w:rFonts w:ascii="Arial" w:hAnsi="Arial"/>
-              </w:rPr>
-              <w:t xml:space="preserve">: </w:t>
+              <w:t xml:space="preserve">     </w:t>
+            </w:r>
+            <w:proofErr w:type="gramStart"/>
+            <w:r>
+              <w:rPr>
+                <w:rFonts w:ascii="Arial" w:hAnsi="Arial"/>
+              </w:rPr>
+              <w:t xml:space="preserve">  </w:t>
+            </w:r>
+            <w:r>
+              <w:rPr>
+                <w:rFonts w:ascii="Arial" w:hAnsi="Arial"/>
+              </w:rPr>
+              <w:t>:</w:t>
+            </w:r>
+            <w:proofErr w:type="gramEnd"/>
+            <w:r>
+              <w:rPr>
+                <w:rFonts w:ascii="Arial" w:hAnsi="Arial"/>
+              </w:rPr>
+              <w:t xml:space="preserve"> </w:t>
             </w:r>
             <w:r>
               <w:rPr>
@@ -7500,6 +7949,7 @@
               <w:rPr>
                 <w:rFonts w:ascii="Arial" w:hAnsi="Arial"/>
               </w:rPr>
+              <w:lastRenderedPageBreak/>
               <w:t>Diámetro de las ruedas/</w:t>
             </w:r>
             <w:r>
@@ -7512,7 +7962,21 @@
               <w:rPr>
                 <w:rFonts w:ascii="Arial" w:hAnsi="Arial"/>
               </w:rPr>
-              <w:t xml:space="preserve">          : </w:t>
+              <w:t xml:space="preserve">        </w:t>
+            </w:r>
+            <w:proofErr w:type="gramStart"/>
+            <w:r>
+              <w:rPr>
+                <w:rFonts w:ascii="Arial" w:hAnsi="Arial"/>
+              </w:rPr>
+              <w:t xml:space="preserve">  :</w:t>
+            </w:r>
+            <w:proofErr w:type="gramEnd"/>
+            <w:r>
+              <w:rPr>
+                <w:rFonts w:ascii="Arial" w:hAnsi="Arial"/>
+              </w:rPr>
+              <w:t xml:space="preserve"> </w:t>
             </w:r>
             <w:r>
               <w:rPr>
@@ -7658,6 +8122,7 @@
               <w:t>{</w:t>
             </w:r>
             <w:proofErr w:type="spellStart"/>
+            <w:proofErr w:type="gramStart"/>
             <w:r>
               <w:rPr>
                 <w:rFonts w:ascii="Arial" w:hAnsi="Arial"/>
@@ -7665,6 +8130,7 @@
               <w:t>ArticuloDefiniciones.Puente.Ruedas</w:t>
             </w:r>
             <w:proofErr w:type="spellEnd"/>
+            <w:proofErr w:type="gramEnd"/>
             <w:r>
               <w:rPr>
                 <w:rFonts w:ascii="Arial" w:hAnsi="Arial"/>
@@ -7730,7 +8196,21 @@
               <w:rPr>
                 <w:rFonts w:ascii="Arial" w:hAnsi="Arial"/>
               </w:rPr>
-              <w:t xml:space="preserve">                         : </w:t>
+              <w:t xml:space="preserve">                       </w:t>
+            </w:r>
+            <w:proofErr w:type="gramStart"/>
+            <w:r>
+              <w:rPr>
+                <w:rFonts w:ascii="Arial" w:hAnsi="Arial"/>
+              </w:rPr>
+              <w:t xml:space="preserve">  :</w:t>
+            </w:r>
+            <w:proofErr w:type="gramEnd"/>
+            <w:r>
+              <w:rPr>
+                <w:rFonts w:ascii="Arial" w:hAnsi="Arial"/>
+              </w:rPr>
+              <w:t xml:space="preserve"> </w:t>
             </w:r>
             <w:r>
               <w:rPr>
@@ -7852,6 +8332,7 @@
               </w:rPr>
               <w:t xml:space="preserve">   </w:t>
             </w:r>
+            <w:proofErr w:type="gramStart"/>
             <w:r>
               <w:rPr>
                 <w:rFonts w:ascii="Arial" w:hAnsi="Arial"/>
@@ -7862,7 +8343,14 @@
               <w:rPr>
                 <w:rFonts w:ascii="Arial" w:hAnsi="Arial"/>
               </w:rPr>
-              <w:t xml:space="preserve">: </w:t>
+              <w:t>:</w:t>
+            </w:r>
+            <w:proofErr w:type="gramEnd"/>
+            <w:r>
+              <w:rPr>
+                <w:rFonts w:ascii="Arial" w:hAnsi="Arial"/>
+              </w:rPr>
+              <w:t xml:space="preserve"> </w:t>
             </w:r>
             <w:r>
               <w:rPr>
@@ -7959,8 +8447,21 @@
               <w:rPr>
                 <w:rFonts w:ascii="Arial" w:hAnsi="Arial"/>
               </w:rPr>
-              <w:lastRenderedPageBreak/>
-              <w:t xml:space="preserve">Potencia/motor                            : </w:t>
+              <w:t xml:space="preserve">Potencia/motor                          </w:t>
+            </w:r>
+            <w:proofErr w:type="gramStart"/>
+            <w:r>
+              <w:rPr>
+                <w:rFonts w:ascii="Arial" w:hAnsi="Arial"/>
+              </w:rPr>
+              <w:t xml:space="preserve">  :</w:t>
+            </w:r>
+            <w:proofErr w:type="gramEnd"/>
+            <w:r>
+              <w:rPr>
+                <w:rFonts w:ascii="Arial" w:hAnsi="Arial"/>
+              </w:rPr>
+              <w:t xml:space="preserve"> </w:t>
             </w:r>
             <w:r>
               <w:rPr>
@@ -8013,7 +8514,7 @@
       </w:tr>
       <w:tr>
         <w:trPr>
-          <w:trHeight w:val="540"/>
+          <w:trHeight w:val="832"/>
         </w:trPr>
         <w:tc>
           <w:tcPr>
@@ -8022,12 +8523,35 @@
           </w:tcPr>
           <w:p>
             <w:pPr>
-              <w:pStyle w:val="Prrafodelista"/>
-              <w:ind w:left="0"/>
+              <w:numPr>
+                <w:ilvl w:val="0"/>
+                <w:numId w:val="1"/>
+              </w:numPr>
+              <w:ind w:left="283"/>
               <w:rPr>
                 <w:rFonts w:ascii="Arial" w:hAnsi="Arial" w:cs="Arial"/>
               </w:rPr>
             </w:pPr>
+            <w:r>
+              <w:rPr>
+                <w:rFonts w:ascii="Arial" w:hAnsi="Arial"/>
+              </w:rPr>
+              <w:t xml:space="preserve">Tope </w:t>
+            </w:r>
+            <w:proofErr w:type="spellStart"/>
+            <w:r>
+              <w:rPr>
+                <w:rFonts w:ascii="Arial" w:hAnsi="Arial"/>
+              </w:rPr>
+              <w:t>Hidraulico</w:t>
+            </w:r>
+            <w:proofErr w:type="spellEnd"/>
+            <w:r>
+              <w:rPr>
+                <w:rFonts w:ascii="Arial" w:hAnsi="Arial"/>
+              </w:rPr>
+              <w:t xml:space="preserve">: </w:t>
+            </w:r>
             <w:r>
               <w:rPr>
                 <w:rFonts w:ascii="Arial" w:hAnsi="Arial" w:cs="Arial"/>
@@ -8080,6 +8604,7 @@
               <w:t>{</w:t>
             </w:r>
             <w:proofErr w:type="spellStart"/>
+            <w:proofErr w:type="gramStart"/>
             <w:r>
               <w:rPr>
                 <w:rFonts w:ascii="Arial" w:hAnsi="Arial"/>
@@ -8097,6 +8622,7 @@
               <w:t>Puente.Observaciones</w:t>
             </w:r>
             <w:proofErr w:type="spellEnd"/>
+            <w:proofErr w:type="gramEnd"/>
             <w:r>
               <w:rPr>
                 <w:rFonts w:ascii="Arial" w:hAnsi="Arial"/>
@@ -8222,7 +8748,25 @@
                 <w:color w:val="000000"/>
                 <w:szCs w:val="24"/>
               </w:rPr>
-              <w:t xml:space="preserve"> 1.Tipo de control}</w:t>
+              <w:t xml:space="preserve"> </w:t>
+            </w:r>
+            <w:proofErr w:type="gramStart"/>
+            <w:r>
+              <w:rPr>
+                <w:rFonts w:ascii="Arial" w:hAnsi="Arial" w:cs="Arial"/>
+                <w:color w:val="000000"/>
+                <w:szCs w:val="24"/>
+              </w:rPr>
+              <w:t>1.Tipo</w:t>
+            </w:r>
+            <w:proofErr w:type="gramEnd"/>
+            <w:r>
+              <w:rPr>
+                <w:rFonts w:ascii="Arial" w:hAnsi="Arial" w:cs="Arial"/>
+                <w:color w:val="000000"/>
+                <w:szCs w:val="24"/>
+              </w:rPr>
+              <w:t xml:space="preserve"> de control}</w:t>
             </w:r>
             <w:r>
               <w:rPr>
@@ -8329,7 +8873,25 @@
                 <w:color w:val="000000"/>
                 <w:szCs w:val="24"/>
               </w:rPr>
-              <w:t xml:space="preserve"> 2.Tipo de control}</w:t>
+              <w:t xml:space="preserve"> </w:t>
+            </w:r>
+            <w:proofErr w:type="gramStart"/>
+            <w:r>
+              <w:rPr>
+                <w:rFonts w:ascii="Arial" w:hAnsi="Arial" w:cs="Arial"/>
+                <w:color w:val="000000"/>
+                <w:szCs w:val="24"/>
+              </w:rPr>
+              <w:t>2.Tipo</w:t>
+            </w:r>
+            <w:proofErr w:type="gramEnd"/>
+            <w:r>
+              <w:rPr>
+                <w:rFonts w:ascii="Arial" w:hAnsi="Arial" w:cs="Arial"/>
+                <w:color w:val="000000"/>
+                <w:szCs w:val="24"/>
+              </w:rPr>
+              <w:t xml:space="preserve"> de control}</w:t>
             </w:r>
             <w:r>
               <w:rPr>
@@ -8407,6 +8969,7 @@
               <w:t>{</w:t>
             </w:r>
             <w:proofErr w:type="spellStart"/>
+            <w:proofErr w:type="gramStart"/>
             <w:r>
               <w:rPr>
                 <w:rFonts w:ascii="Arial" w:hAnsi="Arial"/>
@@ -8420,6 +8983,7 @@
               <w:t>Tipo</w:t>
             </w:r>
             <w:proofErr w:type="spellEnd"/>
+            <w:proofErr w:type="gramEnd"/>
             <w:r>
               <w:rPr>
                 <w:rFonts w:ascii="Arial" w:hAnsi="Arial"/>
@@ -8473,7 +9037,21 @@
                 <w:rFonts w:ascii="Arial" w:hAnsi="Arial"/>
               </w:rPr>
               <w:tab/>
-              <w:t xml:space="preserve">   : </w:t>
+              <w:t xml:space="preserve"> </w:t>
+            </w:r>
+            <w:proofErr w:type="gramStart"/>
+            <w:r>
+              <w:rPr>
+                <w:rFonts w:ascii="Arial" w:hAnsi="Arial"/>
+              </w:rPr>
+              <w:t xml:space="preserve">  :</w:t>
+            </w:r>
+            <w:proofErr w:type="gramEnd"/>
+            <w:r>
+              <w:rPr>
+                <w:rFonts w:ascii="Arial" w:hAnsi="Arial"/>
+              </w:rPr>
+              <w:t xml:space="preserve"> </w:t>
             </w:r>
             <w:r>
               <w:rPr>
@@ -8535,6 +9113,7 @@
               </w:rPr>
               <w:t xml:space="preserve">Voltaje de control     </w:t>
             </w:r>
+            <w:proofErr w:type="gramStart"/>
             <w:r>
               <w:rPr>
                 <w:rFonts w:ascii="Arial" w:hAnsi="Arial"/>
@@ -8548,6 +9127,7 @@
               </w:rPr>
               <w:t>:</w:t>
             </w:r>
+            <w:proofErr w:type="gramEnd"/>
             <w:r>
               <w:rPr>
                 <w:rFonts w:ascii="Arial" w:hAnsi="Arial"/>
@@ -8655,6 +9235,7 @@
                 <w:szCs w:val="28"/>
                 <w:highlight w:val="yellow"/>
               </w:rPr>
+              <w:lastRenderedPageBreak/>
               <w:t>**Validar**</w:t>
             </w:r>
             <w:r>
@@ -8722,12 +9303,13 @@
               </w:rPr>
               <w:t>}</w:t>
             </w:r>
-            <w:r>
-              <w:rPr>
-                <w:rFonts w:ascii="Arial" w:hAnsi="Arial"/>
-              </w:rPr>
-              <w:t xml:space="preserve"> </w:t>
-            </w:r>
+          </w:p>
+          <w:p>
+            <w:pPr>
+              <w:rPr>
+                <w:rFonts w:ascii="Arial" w:hAnsi="Arial"/>
+              </w:rPr>
+            </w:pPr>
             <w:r>
               <w:rPr>
                 <w:rFonts w:ascii="Arial" w:hAnsi="Arial"/>
@@ -8748,11 +9330,18 @@
               </w:rPr>
               <w:t>}</w:t>
             </w:r>
-            <w:r>
-              <w:rPr>
-                <w:rFonts w:ascii="Arial" w:hAnsi="Arial"/>
-              </w:rPr>
-              <w:t xml:space="preserve"> {</w:t>
+          </w:p>
+          <w:p>
+            <w:pPr>
+              <w:rPr>
+                <w:rFonts w:ascii="Arial" w:hAnsi="Arial"/>
+              </w:rPr>
+            </w:pPr>
+            <w:r>
+              <w:rPr>
+                <w:rFonts w:ascii="Arial" w:hAnsi="Arial"/>
+              </w:rPr>
+              <w:t>{</w:t>
             </w:r>
             <w:proofErr w:type="spellStart"/>
             <w:r>
@@ -8809,7 +9398,6 @@
                 <w:szCs w:val="28"/>
                 <w:highlight w:val="yellow"/>
               </w:rPr>
-              <w:lastRenderedPageBreak/>
               <w:t>**Validar**</w:t>
             </w:r>
             <w:r>
@@ -8912,14 +9500,30 @@
                 <w:rFonts w:ascii="Arial" w:hAnsi="Arial"/>
                 <w:color w:val="000000"/>
               </w:rPr>
-              <w:t xml:space="preserve">   </w:t>
-            </w:r>
+              <w:t xml:space="preserve"> </w:t>
+            </w:r>
+            <w:proofErr w:type="gramStart"/>
             <w:r>
               <w:rPr>
                 <w:rFonts w:ascii="Arial" w:hAnsi="Arial"/>
                 <w:color w:val="000000"/>
               </w:rPr>
-              <w:t xml:space="preserve">: </w:t>
+              <w:t xml:space="preserve">  </w:t>
+            </w:r>
+            <w:r>
+              <w:rPr>
+                <w:rFonts w:ascii="Arial" w:hAnsi="Arial"/>
+                <w:color w:val="000000"/>
+              </w:rPr>
+              <w:t>:</w:t>
+            </w:r>
+            <w:proofErr w:type="gramEnd"/>
+            <w:r>
+              <w:rPr>
+                <w:rFonts w:ascii="Arial" w:hAnsi="Arial"/>
+                <w:color w:val="000000"/>
+              </w:rPr>
+              <w:t xml:space="preserve"> </w:t>
             </w:r>
             <w:r>
               <w:rPr>
@@ -9020,13 +9624,27 @@
               <w:rPr>
                 <w:rFonts w:ascii="Arial" w:hAnsi="Arial"/>
               </w:rPr>
-              <w:t>por rueda</w:t>
-            </w:r>
-            <w:r>
-              <w:rPr>
-                <w:rFonts w:ascii="Arial" w:hAnsi="Arial"/>
-              </w:rPr>
-              <w:t xml:space="preserve"> : </w:t>
+              <w:t xml:space="preserve">por </w:t>
+            </w:r>
+            <w:proofErr w:type="gramStart"/>
+            <w:r>
+              <w:rPr>
+                <w:rFonts w:ascii="Arial" w:hAnsi="Arial"/>
+              </w:rPr>
+              <w:t>rueda</w:t>
+            </w:r>
+            <w:r>
+              <w:rPr>
+                <w:rFonts w:ascii="Arial" w:hAnsi="Arial"/>
+              </w:rPr>
+              <w:t xml:space="preserve"> :</w:t>
+            </w:r>
+            <w:proofErr w:type="gramEnd"/>
+            <w:r>
+              <w:rPr>
+                <w:rFonts w:ascii="Arial" w:hAnsi="Arial"/>
+              </w:rPr>
+              <w:t xml:space="preserve"> </w:t>
             </w:r>
             <w:r>
               <w:rPr>
@@ -9177,6 +9795,7 @@
               <w:t>{</w:t>
             </w:r>
             <w:proofErr w:type="spellStart"/>
+            <w:proofErr w:type="gramStart"/>
             <w:r>
               <w:rPr>
                 <w:rFonts w:ascii="Arial" w:hAnsi="Arial" w:cs="Arial"/>
@@ -9186,6 +9805,7 @@
               <w:t>BahiaDefiniciones.Alimentacion.Longitud</w:t>
             </w:r>
             <w:proofErr w:type="spellEnd"/>
+            <w:proofErr w:type="gramEnd"/>
             <w:r>
               <w:rPr>
                 <w:rFonts w:ascii="Arial" w:hAnsi="Arial" w:cs="Arial"/>
@@ -9232,6 +9852,7 @@
               <w:t xml:space="preserve"> {</w:t>
             </w:r>
             <w:proofErr w:type="spellStart"/>
+            <w:proofErr w:type="gramStart"/>
             <w:r>
               <w:rPr>
                 <w:rFonts w:ascii="Arial" w:hAnsi="Arial" w:cs="Arial"/>
@@ -9241,6 +9862,7 @@
               <w:t>BahiaDefiniciones.Alimentacion.Amperaje</w:t>
             </w:r>
             <w:proofErr w:type="spellEnd"/>
+            <w:proofErr w:type="gramEnd"/>
             <w:r>
               <w:rPr>
                 <w:rFonts w:ascii="Arial" w:hAnsi="Arial" w:cs="Arial"/>
@@ -9298,6 +9920,7 @@
               <w:t>electrica</w:t>
             </w:r>
             <w:proofErr w:type="spellEnd"/>
+            <w:proofErr w:type="gramStart"/>
             <w:r>
               <w:rPr>
                 <w:rFonts w:ascii="Roboto" w:hAnsi="Roboto"/>
@@ -9315,6 +9938,7 @@
               <w:t>{</w:t>
             </w:r>
             <w:proofErr w:type="spellStart"/>
+            <w:proofErr w:type="gramEnd"/>
             <w:r>
               <w:rPr>
                 <w:rFonts w:ascii="Arial" w:hAnsi="Arial" w:cs="Arial"/>
@@ -9442,6 +10066,7 @@
                 <w:b/>
                 <w:color w:val="1F497D"/>
               </w:rPr>
+              <w:lastRenderedPageBreak/>
               <w:t>Rieles de la vía para la unidad</w:t>
             </w:r>
           </w:p>
@@ -9473,6 +10098,7 @@
               <w:t>{</w:t>
             </w:r>
             <w:proofErr w:type="spellStart"/>
+            <w:proofErr w:type="gramStart"/>
             <w:r>
               <w:rPr>
                 <w:rFonts w:ascii="Arial" w:hAnsi="Arial" w:cs="Arial"/>
@@ -9482,6 +10108,7 @@
               <w:t>BahiaDefiniciones.Riel.Metros</w:t>
             </w:r>
             <w:proofErr w:type="spellEnd"/>
+            <w:proofErr w:type="gramEnd"/>
             <w:r>
               <w:rPr>
                 <w:rFonts w:ascii="Arial" w:hAnsi="Arial" w:cs="Arial"/>
@@ -9535,6 +10162,7 @@
               <w:t>{</w:t>
             </w:r>
             <w:proofErr w:type="spellStart"/>
+            <w:proofErr w:type="gramStart"/>
             <w:r>
               <w:rPr>
                 <w:rFonts w:ascii="Arial" w:hAnsi="Arial" w:cs="Arial"/>
@@ -9544,6 +10172,7 @@
               <w:t>BahiaDefiniciones.Riel.Tipo</w:t>
             </w:r>
             <w:proofErr w:type="spellEnd"/>
+            <w:proofErr w:type="gramEnd"/>
             <w:r>
               <w:rPr>
                 <w:rFonts w:ascii="Arial" w:hAnsi="Arial" w:cs="Arial"/>
@@ -9789,6 +10418,7 @@
         <w:t>{</w:t>
       </w:r>
       <w:proofErr w:type="spellStart"/>
+      <w:proofErr w:type="gramStart"/>
       <w:r>
         <w:rPr>
           <w:rFonts w:ascii="Arial" w:hAnsi="Arial" w:cs="Arial"/>
@@ -9799,6 +10429,7 @@
         <w:t>Oferta.Cliente.Nombre</w:t>
       </w:r>
       <w:proofErr w:type="spellEnd"/>
+      <w:proofErr w:type="gramEnd"/>
       <w:r>
         <w:rPr>
           <w:rFonts w:ascii="Arial" w:hAnsi="Arial" w:cs="Arial"/>
@@ -10155,7 +10786,7 @@
         <w:ind w:left="2948"/>
         <w:jc w:val="both"/>
         <w:sectPr>
-          <w:footerReference w:type="default" r:id="rId15"/>
+          <w:footerReference w:type="default" r:id="rId11"/>
           <w:endnotePr>
             <w:numFmt w:val="decimal"/>
           </w:endnotePr>
@@ -10501,6 +11132,7 @@
                 <w:szCs w:val="24"/>
               </w:rPr>
             </w:pPr>
+            <w:proofErr w:type="gramStart"/>
             <w:r>
               <w:rPr>
                 <w:rFonts w:ascii="Arial" w:hAnsi="Arial"/>
@@ -10515,6 +11147,7 @@
               </w:rPr>
               <w:t xml:space="preserve"> :</w:t>
             </w:r>
+            <w:proofErr w:type="gramEnd"/>
             <w:r>
               <w:rPr>
                 <w:rFonts w:ascii="Arial" w:hAnsi="Arial"/>
@@ -10610,6 +11243,7 @@
               <w:t xml:space="preserve">Altura de </w:t>
             </w:r>
             <w:proofErr w:type="spellStart"/>
+            <w:proofErr w:type="gramStart"/>
             <w:r>
               <w:rPr>
                 <w:rFonts w:ascii="Arial" w:hAnsi="Arial"/>
@@ -10623,7 +11257,15 @@
                 <w:rFonts w:ascii="Arial" w:hAnsi="Arial"/>
                 <w:szCs w:val="24"/>
               </w:rPr>
-              <w:t xml:space="preserve"> : {</w:t>
+              <w:t xml:space="preserve"> :</w:t>
+            </w:r>
+            <w:proofErr w:type="gramEnd"/>
+            <w:r>
+              <w:rPr>
+                <w:rFonts w:ascii="Arial" w:hAnsi="Arial"/>
+                <w:szCs w:val="24"/>
+              </w:rPr>
+              <w:t xml:space="preserve"> {</w:t>
             </w:r>
             <w:proofErr w:type="spellStart"/>
             <w:r>
@@ -10820,6 +11462,7 @@
               <w:t>{</w:t>
             </w:r>
             <w:proofErr w:type="spellStart"/>
+            <w:proofErr w:type="gramStart"/>
             <w:r>
               <w:rPr>
                 <w:rFonts w:ascii="Arial" w:hAnsi="Arial"/>
@@ -10828,6 +11471,7 @@
               <w:t>ArticuloDefiniciones.Carro.Carro</w:t>
             </w:r>
             <w:proofErr w:type="spellEnd"/>
+            <w:proofErr w:type="gramEnd"/>
             <w:r>
               <w:rPr>
                 <w:rFonts w:ascii="Arial" w:hAnsi="Arial"/>
@@ -11184,7 +11828,7 @@
       <w:pPr>
         <w:jc w:val="right"/>
         <w:sectPr>
-          <w:footerReference w:type="default" r:id="rId16"/>
+          <w:footerReference w:type="default" r:id="rId12"/>
           <w:endnotePr>
             <w:numFmt w:val="decimal"/>
           </w:endnotePr>
@@ -11272,6 +11916,7 @@
         <w:t>{</w:t>
       </w:r>
       <w:proofErr w:type="spellStart"/>
+      <w:proofErr w:type="gramStart"/>
       <w:r>
         <w:rPr>
           <w:rFonts w:cs="Arial"/>
@@ -11280,6 +11925,7 @@
         <w:t>Oferta.Cliente.Nombre</w:t>
       </w:r>
       <w:proofErr w:type="spellEnd"/>
+      <w:proofErr w:type="gramEnd"/>
       <w:r>
         <w:rPr>
           <w:rFonts w:cs="Arial"/>
@@ -11326,6 +11972,7 @@
         <w:t>{</w:t>
       </w:r>
       <w:proofErr w:type="spellStart"/>
+      <w:proofErr w:type="gramStart"/>
       <w:r>
         <w:rPr>
           <w:rFonts w:ascii="Arial" w:hAnsi="Arial" w:cs="Arial"/>
@@ -11334,6 +11981,7 @@
         <w:t>Oferta.Cliente.Nombre</w:t>
       </w:r>
       <w:proofErr w:type="spellEnd"/>
+      <w:proofErr w:type="gramEnd"/>
       <w:r>
         <w:rPr>
           <w:rFonts w:ascii="Arial" w:hAnsi="Arial" w:cs="Arial"/>
@@ -11373,6 +12021,7 @@
         <w:t>{</w:t>
       </w:r>
       <w:proofErr w:type="spellStart"/>
+      <w:proofErr w:type="gramStart"/>
       <w:r>
         <w:rPr>
           <w:rFonts w:ascii="Arial" w:hAnsi="Arial" w:cs="Arial"/>
@@ -11381,6 +12030,7 @@
         <w:t>Oferta.Cliente.Nombre</w:t>
       </w:r>
       <w:proofErr w:type="spellEnd"/>
+      <w:proofErr w:type="gramEnd"/>
       <w:r>
         <w:rPr>
           <w:rFonts w:ascii="Arial" w:hAnsi="Arial" w:cs="Arial"/>
@@ -11425,7 +12075,15 @@
           <w:rFonts w:ascii="Arial" w:hAnsi="Arial"/>
           <w:b/>
         </w:rPr>
-        <w:t xml:space="preserve">Condiciones de pago     </w:t>
+        <w:t xml:space="preserve">Condiciones de pago    </w:t>
+      </w:r>
+      <w:proofErr w:type="gramStart"/>
+      <w:r>
+        <w:rPr>
+          <w:rFonts w:ascii="Arial" w:hAnsi="Arial"/>
+          <w:b/>
+        </w:rPr>
+        <w:t xml:space="preserve"> </w:t>
       </w:r>
       <w:r>
         <w:rPr>
@@ -11434,6 +12092,7 @@
         </w:rPr>
         <w:t xml:space="preserve"> :</w:t>
       </w:r>
+      <w:proofErr w:type="gramEnd"/>
       <w:r>
         <w:rPr>
           <w:rFonts w:ascii="Arial" w:hAnsi="Arial"/>
@@ -11476,74 +12135,122 @@
           <w:rFonts w:ascii="Arial" w:hAnsi="Arial"/>
         </w:rPr>
       </w:pPr>
-      <w:r>
-        <w:rPr>
-          <w:rFonts w:ascii="Arial" w:hAnsi="Arial"/>
-          <w:b/>
-        </w:rPr>
-        <w:t>Tiempo de entrega</w:t>
-      </w:r>
-      <w:r>
-        <w:rPr>
-          <w:rFonts w:ascii="Arial" w:hAnsi="Arial"/>
-        </w:rPr>
-        <w:tab/>
-        <w:t xml:space="preserve">: </w:t>
-      </w:r>
-      <w:r>
-        <w:rPr>
-          <w:rFonts w:ascii="Arial" w:hAnsi="Arial"/>
-        </w:rPr>
-        <w:t>{</w:t>
-      </w:r>
-      <w:proofErr w:type="spellStart"/>
-      <w:r>
-        <w:rPr>
-          <w:rFonts w:ascii="Arial" w:hAnsi="Arial"/>
-        </w:rPr>
-        <w:t>etiquetaTiempoEntrega</w:t>
-      </w:r>
-      <w:proofErr w:type="spellEnd"/>
-      <w:r>
-        <w:rPr>
-          <w:rFonts w:ascii="Arial" w:hAnsi="Arial"/>
-        </w:rPr>
-        <w:t>}</w:t>
-      </w:r>
+    </w:p>
+    <w:tbl>
+      <w:tblPr>
+        <w:tblW w:w="0" w:type="auto"/>
+        <w:tblLook w:val="04A0" w:firstRow="1" w:lastRow="0" w:firstColumn="1" w:lastColumn="0" w:noHBand="0" w:noVBand="1"/>
+      </w:tblPr>
+      <w:tblGrid>
+        <w:gridCol w:w="3227"/>
+        <w:gridCol w:w="7453"/>
+      </w:tblGrid>
+      <w:tr>
+        <w:trPr>
+          <w:trHeight w:val="1513"/>
+        </w:trPr>
+        <w:tc>
+          <w:tcPr>
+            <w:tcW w:w="3227" w:type="dxa"/>
+            <w:shd w:val="clear" w:color="auto" w:fill="auto"/>
+          </w:tcPr>
+          <w:p>
+            <w:pPr>
+              <w:rPr>
+                <w:rFonts w:ascii="Arial" w:hAnsi="Arial"/>
+              </w:rPr>
+            </w:pPr>
+            <w:r>
+              <w:rPr>
+                <w:rFonts w:ascii="Arial" w:hAnsi="Arial"/>
+                <w:b/>
+              </w:rPr>
+              <w:t>Tiempo de entrega</w:t>
+            </w:r>
+            <w:r>
+              <w:rPr>
+                <w:rFonts w:ascii="Arial" w:hAnsi="Arial"/>
+              </w:rPr>
+              <w:tab/>
+              <w:t>:</w:t>
+            </w:r>
+          </w:p>
+        </w:tc>
+        <w:tc>
+          <w:tcPr>
+            <w:tcW w:w="7453" w:type="dxa"/>
+            <w:shd w:val="clear" w:color="auto" w:fill="auto"/>
+          </w:tcPr>
+          <w:p>
+            <w:pPr>
+              <w:rPr>
+                <w:rFonts w:ascii="Arial" w:hAnsi="Arial"/>
+              </w:rPr>
+            </w:pPr>
+            <w:r>
+              <w:rPr>
+                <w:rFonts w:ascii="Arial" w:hAnsi="Arial"/>
+              </w:rPr>
+              <w:t>{</w:t>
+            </w:r>
+            <w:proofErr w:type="spellStart"/>
+            <w:r>
+              <w:rPr>
+                <w:rFonts w:ascii="Arial" w:hAnsi="Arial"/>
+              </w:rPr>
+              <w:t>etiquetaTiempoEntrega</w:t>
+            </w:r>
+            <w:proofErr w:type="spellEnd"/>
+            <w:r>
+              <w:rPr>
+                <w:rFonts w:ascii="Arial" w:hAnsi="Arial"/>
+              </w:rPr>
+              <w:t>}</w:t>
+            </w:r>
+          </w:p>
+          <w:p>
+            <w:pPr>
+              <w:rPr>
+                <w:rFonts w:ascii="Arial" w:hAnsi="Arial"/>
+              </w:rPr>
+            </w:pPr>
+          </w:p>
+        </w:tc>
+      </w:tr>
+    </w:tbl>
+    <w:p>
+      <w:pPr>
+        <w:rPr>
+          <w:rFonts w:ascii="Arial" w:hAnsi="Arial" w:cs="Arial"/>
+          <w:b/>
+        </w:rPr>
+      </w:pPr>
     </w:p>
     <w:p>
       <w:pPr>
-        <w:rPr>
-          <w:rFonts w:ascii="Arial" w:hAnsi="Arial" w:cs="Arial"/>
-          <w:b/>
-        </w:rPr>
-      </w:pPr>
+        <w:ind w:left="2948"/>
+        <w:rPr>
+          <w:rFonts w:ascii="Arial" w:hAnsi="Arial" w:cs="Arial"/>
+        </w:rPr>
+      </w:pPr>
+      <w:r>
+        <w:rPr>
+          <w:rFonts w:ascii="Arial" w:hAnsi="Arial"/>
+        </w:rPr>
+        <w:t>Usted es responsable de autorizar el plano aprobado, y se deben definir claramente todos los detalles técnicos.</w:t>
+      </w:r>
     </w:p>
     <w:p>
       <w:pPr>
-        <w:ind w:left="2948"/>
-        <w:rPr>
-          <w:rFonts w:ascii="Arial" w:hAnsi="Arial" w:cs="Arial"/>
-        </w:rPr>
-      </w:pPr>
-      <w:r>
-        <w:rPr>
-          <w:rFonts w:ascii="Arial" w:hAnsi="Arial"/>
-        </w:rPr>
-        <w:t>Usted es responsable de autorizar el plano aprobado, y se deben definir claramente todos los detalles técnicos.</w:t>
-      </w:r>
+        <w:rPr>
+          <w:rFonts w:ascii="Arial" w:hAnsi="Arial" w:cs="Arial"/>
+        </w:rPr>
+      </w:pPr>
     </w:p>
     <w:p>
       <w:pPr>
         <w:rPr>
           <w:rFonts w:ascii="Arial" w:hAnsi="Arial" w:cs="Arial"/>
-        </w:rPr>
-      </w:pPr>
-    </w:p>
-    <w:p>
-      <w:pPr>
-        <w:rPr>
-          <w:rFonts w:ascii="Arial" w:hAnsi="Arial" w:cs="Arial"/>
           <w:b/>
           <w:bCs/>
           <w:szCs w:val="24"/>
@@ -11599,6 +12306,7 @@
         <w:t>{</w:t>
       </w:r>
       <w:proofErr w:type="spellStart"/>
+      <w:proofErr w:type="gramStart"/>
       <w:r>
         <w:rPr>
           <w:rFonts w:ascii="Arial" w:hAnsi="Arial" w:cs="Arial"/>
@@ -11607,6 +12315,7 @@
         <w:t>Oferta.Cliente.Nombre</w:t>
       </w:r>
       <w:proofErr w:type="spellEnd"/>
+      <w:proofErr w:type="gramEnd"/>
       <w:r>
         <w:rPr>
           <w:rFonts w:ascii="Arial" w:hAnsi="Arial" w:cs="Arial"/>
@@ -11793,6 +12502,7 @@
               <w:t xml:space="preserve"> </w:t>
             </w:r>
             <w:proofErr w:type="spellStart"/>
+            <w:proofErr w:type="gramStart"/>
             <w:r>
               <w:rPr>
                 <w:rFonts w:ascii="Arial" w:hAnsi="Arial" w:cs="Arial"/>
@@ -11803,6 +12513,7 @@
               <w:t>A.Telephone</w:t>
             </w:r>
             <w:proofErr w:type="spellEnd"/>
+            <w:proofErr w:type="gramEnd"/>
             <w:r>
               <w:rPr>
                 <w:rFonts w:ascii="Arial" w:hAnsi="Arial" w:cs="Arial"/>
@@ -11868,6 +12579,7 @@
               <w:t xml:space="preserve"> </w:t>
             </w:r>
             <w:proofErr w:type="spellStart"/>
+            <w:proofErr w:type="gramStart"/>
             <w:r>
               <w:rPr>
                 <w:rFonts w:ascii="Arial" w:hAnsi="Arial" w:cs="Arial"/>
@@ -11878,6 +12590,7 @@
               <w:t>A.Mobil</w:t>
             </w:r>
             <w:proofErr w:type="spellEnd"/>
+            <w:proofErr w:type="gramEnd"/>
             <w:r>
               <w:rPr>
                 <w:rFonts w:ascii="Arial" w:hAnsi="Arial" w:cs="Arial"/>
@@ -11911,6 +12624,7 @@
               <w:t>{</w:t>
             </w:r>
             <w:proofErr w:type="spellStart"/>
+            <w:proofErr w:type="gramStart"/>
             <w:r>
               <w:rPr>
                 <w:rFonts w:ascii="Arial" w:hAnsi="Arial" w:cs="Arial"/>
@@ -11921,6 +12635,7 @@
               <w:t>vendedor.email</w:t>
             </w:r>
             <w:proofErr w:type="spellEnd"/>
+            <w:proofErr w:type="gramEnd"/>
             <w:r>
               <w:rPr>
                 <w:rFonts w:ascii="Arial" w:hAnsi="Arial" w:cs="Arial"/>
@@ -12030,6 +12745,7 @@
               <w:t xml:space="preserve"> </w:t>
             </w:r>
             <w:proofErr w:type="spellStart"/>
+            <w:proofErr w:type="gramStart"/>
             <w:r>
               <w:rPr>
                 <w:rFonts w:ascii="Arial" w:hAnsi="Arial" w:cs="Arial"/>
@@ -12040,6 +12756,7 @@
               <w:t>A.Telephone</w:t>
             </w:r>
             <w:proofErr w:type="spellEnd"/>
+            <w:proofErr w:type="gramEnd"/>
             <w:r>
               <w:rPr>
                 <w:rFonts w:ascii="Arial" w:hAnsi="Arial" w:cs="Arial"/>
@@ -12104,6 +12821,7 @@
               <w:t xml:space="preserve"> </w:t>
             </w:r>
             <w:proofErr w:type="spellStart"/>
+            <w:proofErr w:type="gramStart"/>
             <w:r>
               <w:rPr>
                 <w:rFonts w:ascii="Arial" w:hAnsi="Arial" w:cs="Arial"/>
@@ -12114,6 +12832,7 @@
               <w:t>A.Mobil</w:t>
             </w:r>
             <w:proofErr w:type="spellEnd"/>
+            <w:proofErr w:type="gramEnd"/>
             <w:r>
               <w:rPr>
                 <w:rFonts w:ascii="Arial" w:hAnsi="Arial" w:cs="Arial"/>
@@ -12180,7 +12899,7 @@
       </w:pPr>
     </w:p>
     <w:sectPr>
-      <w:headerReference w:type="default" r:id="rId17"/>
+      <w:headerReference w:type="default" r:id="rId13"/>
       <w:endnotePr>
         <w:numFmt w:val="decimal"/>
       </w:endnotePr>
@@ -12217,16 +12936,6 @@
   <w:p>
     <w:pPr>
       <w:pStyle w:val="Piedepgina"/>
-    </w:pPr>
-  </w:p>
-</w:ftr>
-</file>
-
-<file path=word/footer2.xml><?xml version="1.0" encoding="utf-8"?>
-<w:ftr xmlns:wpc="http://schemas.microsoft.com/office/word/2010/wordprocessingCanvas" xmlns:cx="http://schemas.microsoft.com/office/drawing/2014/chartex" xmlns:cx1="http://schemas.microsoft.com/office/drawing/2015/9/8/chartex" xmlns:cx2="http://schemas.microsoft.com/office/drawing/2015/10/21/chartex" xmlns:cx3="http://schemas.microsoft.com/office/drawing/2016/5/9/chartex" xmlns:cx4="http://schemas.microsoft.com/office/drawing/2016/5/10/chartex" xmlns:cx5="http://schemas.microsoft.com/office/drawing/2016/5/11/chartex" xmlns:cx6="http://schemas.microsoft.com/office/drawing/2016/5/12/chartex" xmlns:cx7="http://schemas.microsoft.com/office/drawing/2016/5/13/chartex" xmlns:cx8="http://schemas.microsoft.com/office/drawing/2016/5/14/chartex" xmlns:mc="http://schemas.openxmlformats.org/markup-compatibility/2006" xmlns:aink="http://schemas.microsoft.com/office/drawing/2016/ink" xmlns:am3d="http://schemas.microsoft.com/office/drawing/2017/model3d" xmlns:o="urn:schemas-microsoft-com:office:office" xmlns:oel="http://schemas.microsoft.com/office/2019/extlst" xmlns:r="http://schemas.openxmlformats.org/officeDocument/2006/relationships" xmlns:m="http://schemas.openxmlformats.org/officeDocument/2006/math" xmlns:v="urn:schemas-microsoft-com:vml" xmlns:wp14="http://schemas.microsoft.com/office/word/2010/wordprocessingDrawing" xmlns:wp="http://schemas.openxmlformats.org/drawingml/2006/wordprocessingDrawing" xmlns:w10="urn:schemas-microsoft-com:office:word" xmlns:w="http://schemas.openxmlformats.org/wordprocessingml/2006/main" xmlns:w14="http://schemas.microsoft.com/office/word/2010/wordml" xmlns:w15="http://schemas.microsoft.com/office/word/2012/wordml" xmlns:w16cex="http://schemas.microsoft.com/office/word/2018/wordml/cex" xmlns:w16cid="http://schemas.microsoft.com/office/word/2016/wordml/cid" xmlns:w16="http://schemas.microsoft.com/office/word/2018/wordml" xmlns:w16sdtdh="http://schemas.microsoft.com/office/word/2020/wordml/sdtdatahash" xmlns:w16se="http://schemas.microsoft.com/office/word/2015/wordml/symex" xmlns:wpg="http://schemas.microsoft.com/office/word/2010/wordprocessingGroup" xmlns:wpi="http://schemas.microsoft.com/office/word/2010/wordprocessingInk" xmlns:wne="http://schemas.microsoft.com/office/word/2006/wordml" xmlns:wps="http://schemas.microsoft.com/office/word/2010/wordprocessingShape" mc:Ignorable="w14 w15 w16se w16cid w16 w16cex w16sdtdh wp14">
-  <w:p>
-    <w:pPr>
-      <w:pStyle w:val="Piedepgina"/>
       <w:jc w:val="center"/>
       <w:rPr>
         <w:rFonts w:ascii="Arial" w:hAnsi="Arial"/>
@@ -12234,7 +12943,10 @@
       </w:rPr>
     </w:pPr>
     <w:r>
-      <w:pict w14:anchorId="2BFC2D9F">
+      <w:rPr>
+        <w:noProof/>
+      </w:rPr>
+      <w:pict w14:anchorId="6E281CE3">
         <v:shapetype id="_x0000_t75" coordsize="21600,21600" o:spt="75" o:preferrelative="t" path="m@4@5l@4@11@9@11@9@5xe" filled="f" stroked="f">
           <v:stroke joinstyle="miter"/>
           <v:formulas>
@@ -12254,16 +12966,15 @@
           <v:path o:extrusionok="f" gradientshapeok="t" o:connecttype="rect"/>
           <o:lock v:ext="edit" aspectratio="t"/>
         </v:shapetype>
-        <v:shape id="Imagen 7" o:spid="_x0000_s1030" type="#_x0000_t75" alt="Descripción: DCC-P661" style="position:absolute;left:0;text-align:left;margin-left:0;margin-top:1.95pt;width:90pt;height:25.75pt;z-index:1;visibility:visible;mso-wrap-edited:f;mso-width-percent:0;mso-height-percent:0;mso-width-percent:0;mso-height-percent:0">
-          <v:imagedata r:id="rId1" o:title="DCC-P661"/>
-          <w10:wrap type="square"/>
+        <v:shape id="Imagen 1" o:spid="_x0000_s1033" type="#_x0000_t75" style="position:absolute;left:0;text-align:left;margin-left:437.3pt;margin-top:5.7pt;width:107.4pt;height:32.9pt;z-index:5;visibility:visible;mso-wrap-style:square;mso-position-horizontal-relative:text;mso-position-vertical-relative:text;mso-width-relative:page;mso-height-relative:page">
+          <v:imagedata r:id="rId1" o:title=""/>
         </v:shape>
       </w:pict>
     </w:r>
     <w:r>
-      <w:pict w14:anchorId="2832A6E2">
-        <v:shape id="Imagen 6" o:spid="_x0000_s1029" type="#_x0000_t75" alt="Descripción: logo(2)" style="position:absolute;left:0;text-align:left;margin-left:6in;margin-top:-.9pt;width:120pt;height:37pt;z-index:-3;visibility:visible;mso-wrap-edited:f;mso-width-percent:0;mso-height-percent:0;mso-width-percent:0;mso-height-percent:0">
-          <v:imagedata r:id="rId2" o:title="logo(2)"/>
+      <w:pict w14:anchorId="2BFC2D9F">
+        <v:shape id="Imagen 7" o:spid="_x0000_s1030" type="#_x0000_t75" alt="Descripción: DCC-P661" style="position:absolute;left:0;text-align:left;margin-left:0;margin-top:1.95pt;width:90pt;height:25.75pt;z-index:1;visibility:visible;mso-wrap-edited:f;mso-width-percent:0;mso-height-percent:0;mso-width-percent:0;mso-height-percent:0">
+          <v:imagedata r:id="rId2" o:title="DCC-P661"/>
           <w10:wrap type="square"/>
         </v:shape>
       </w:pict>
@@ -12325,17 +13036,7 @@
 </w:ftr>
 </file>
 
-<file path=word/footer3.xml><?xml version="1.0" encoding="utf-8"?>
-<w:ftr xmlns:wpc="http://schemas.microsoft.com/office/word/2010/wordprocessingCanvas" xmlns:cx="http://schemas.microsoft.com/office/drawing/2014/chartex" xmlns:cx1="http://schemas.microsoft.com/office/drawing/2015/9/8/chartex" xmlns:cx2="http://schemas.microsoft.com/office/drawing/2015/10/21/chartex" xmlns:cx3="http://schemas.microsoft.com/office/drawing/2016/5/9/chartex" xmlns:cx4="http://schemas.microsoft.com/office/drawing/2016/5/10/chartex" xmlns:cx5="http://schemas.microsoft.com/office/drawing/2016/5/11/chartex" xmlns:cx6="http://schemas.microsoft.com/office/drawing/2016/5/12/chartex" xmlns:cx7="http://schemas.microsoft.com/office/drawing/2016/5/13/chartex" xmlns:cx8="http://schemas.microsoft.com/office/drawing/2016/5/14/chartex" xmlns:mc="http://schemas.openxmlformats.org/markup-compatibility/2006" xmlns:aink="http://schemas.microsoft.com/office/drawing/2016/ink" xmlns:am3d="http://schemas.microsoft.com/office/drawing/2017/model3d" xmlns:o="urn:schemas-microsoft-com:office:office" xmlns:oel="http://schemas.microsoft.com/office/2019/extlst" xmlns:r="http://schemas.openxmlformats.org/officeDocument/2006/relationships" xmlns:m="http://schemas.openxmlformats.org/officeDocument/2006/math" xmlns:v="urn:schemas-microsoft-com:vml" xmlns:wp14="http://schemas.microsoft.com/office/word/2010/wordprocessingDrawing" xmlns:wp="http://schemas.openxmlformats.org/drawingml/2006/wordprocessingDrawing" xmlns:w10="urn:schemas-microsoft-com:office:word" xmlns:w="http://schemas.openxmlformats.org/wordprocessingml/2006/main" xmlns:w14="http://schemas.microsoft.com/office/word/2010/wordml" xmlns:w15="http://schemas.microsoft.com/office/word/2012/wordml" xmlns:w16cex="http://schemas.microsoft.com/office/word/2018/wordml/cex" xmlns:w16cid="http://schemas.microsoft.com/office/word/2016/wordml/cid" xmlns:w16="http://schemas.microsoft.com/office/word/2018/wordml" xmlns:w16sdtdh="http://schemas.microsoft.com/office/word/2020/wordml/sdtdatahash" xmlns:w16se="http://schemas.microsoft.com/office/word/2015/wordml/symex" xmlns:wpg="http://schemas.microsoft.com/office/word/2010/wordprocessingGroup" xmlns:wpi="http://schemas.microsoft.com/office/word/2010/wordprocessingInk" xmlns:wne="http://schemas.microsoft.com/office/word/2006/wordml" xmlns:wps="http://schemas.microsoft.com/office/word/2010/wordprocessingShape" mc:Ignorable="w14 w15 w16se w16cid w16 w16cex w16sdtdh wp14">
-  <w:p>
-    <w:pPr>
-      <w:pStyle w:val="Piedepgina"/>
-    </w:pPr>
-  </w:p>
-</w:ftr>
-</file>
-
-<file path=word/footer4.xml><?xml version="1.0" encoding="utf-8"?>
+<file path=word/footer2.xml><?xml version="1.0" encoding="utf-8"?>
 <w:ftr xmlns:wpc="http://schemas.microsoft.com/office/word/2010/wordprocessingCanvas" xmlns:cx="http://schemas.microsoft.com/office/drawing/2014/chartex" xmlns:cx1="http://schemas.microsoft.com/office/drawing/2015/9/8/chartex" xmlns:cx2="http://schemas.microsoft.com/office/drawing/2015/10/21/chartex" xmlns:cx3="http://schemas.microsoft.com/office/drawing/2016/5/9/chartex" xmlns:cx4="http://schemas.microsoft.com/office/drawing/2016/5/10/chartex" xmlns:cx5="http://schemas.microsoft.com/office/drawing/2016/5/11/chartex" xmlns:cx6="http://schemas.microsoft.com/office/drawing/2016/5/12/chartex" xmlns:cx7="http://schemas.microsoft.com/office/drawing/2016/5/13/chartex" xmlns:cx8="http://schemas.microsoft.com/office/drawing/2016/5/14/chartex" xmlns:mc="http://schemas.openxmlformats.org/markup-compatibility/2006" xmlns:aink="http://schemas.microsoft.com/office/drawing/2016/ink" xmlns:am3d="http://schemas.microsoft.com/office/drawing/2017/model3d" xmlns:o="urn:schemas-microsoft-com:office:office" xmlns:oel="http://schemas.microsoft.com/office/2019/extlst" xmlns:r="http://schemas.openxmlformats.org/officeDocument/2006/relationships" xmlns:m="http://schemas.openxmlformats.org/officeDocument/2006/math" xmlns:v="urn:schemas-microsoft-com:vml" xmlns:wp14="http://schemas.microsoft.com/office/word/2010/wordprocessingDrawing" xmlns:wp="http://schemas.openxmlformats.org/drawingml/2006/wordprocessingDrawing" xmlns:w10="urn:schemas-microsoft-com:office:word" xmlns:w="http://schemas.openxmlformats.org/wordprocessingml/2006/main" xmlns:w14="http://schemas.microsoft.com/office/word/2010/wordml" xmlns:w15="http://schemas.microsoft.com/office/word/2012/wordml" xmlns:w16cex="http://schemas.microsoft.com/office/word/2018/wordml/cex" xmlns:w16cid="http://schemas.microsoft.com/office/word/2016/wordml/cid" xmlns:w16="http://schemas.microsoft.com/office/word/2018/wordml" xmlns:w16sdtdh="http://schemas.microsoft.com/office/word/2020/wordml/sdtdatahash" xmlns:w16se="http://schemas.microsoft.com/office/word/2015/wordml/symex" xmlns:wpg="http://schemas.microsoft.com/office/word/2010/wordprocessingGroup" xmlns:wpi="http://schemas.microsoft.com/office/word/2010/wordprocessingInk" xmlns:wne="http://schemas.microsoft.com/office/word/2006/wordml" xmlns:wps="http://schemas.microsoft.com/office/word/2010/wordprocessingShape" mc:Ignorable="w14 w15 w16se w16cid w16 w16cex w16sdtdh wp14">
   <w:p>
     <w:pPr>
@@ -12438,7 +13139,7 @@
 </w:ftr>
 </file>
 
-<file path=word/footer5.xml><?xml version="1.0" encoding="utf-8"?>
+<file path=word/footer3.xml><?xml version="1.0" encoding="utf-8"?>
 <w:ftr xmlns:wpc="http://schemas.microsoft.com/office/word/2010/wordprocessingCanvas" xmlns:cx="http://schemas.microsoft.com/office/drawing/2014/chartex" xmlns:cx1="http://schemas.microsoft.com/office/drawing/2015/9/8/chartex" xmlns:cx2="http://schemas.microsoft.com/office/drawing/2015/10/21/chartex" xmlns:cx3="http://schemas.microsoft.com/office/drawing/2016/5/9/chartex" xmlns:cx4="http://schemas.microsoft.com/office/drawing/2016/5/10/chartex" xmlns:cx5="http://schemas.microsoft.com/office/drawing/2016/5/11/chartex" xmlns:cx6="http://schemas.microsoft.com/office/drawing/2016/5/12/chartex" xmlns:cx7="http://schemas.microsoft.com/office/drawing/2016/5/13/chartex" xmlns:cx8="http://schemas.microsoft.com/office/drawing/2016/5/14/chartex" xmlns:mc="http://schemas.openxmlformats.org/markup-compatibility/2006" xmlns:aink="http://schemas.microsoft.com/office/drawing/2016/ink" xmlns:am3d="http://schemas.microsoft.com/office/drawing/2017/model3d" xmlns:o="urn:schemas-microsoft-com:office:office" xmlns:oel="http://schemas.microsoft.com/office/2019/extlst" xmlns:r="http://schemas.openxmlformats.org/officeDocument/2006/relationships" xmlns:m="http://schemas.openxmlformats.org/officeDocument/2006/math" xmlns:v="urn:schemas-microsoft-com:vml" xmlns:wp14="http://schemas.microsoft.com/office/word/2010/wordprocessingDrawing" xmlns:wp="http://schemas.openxmlformats.org/drawingml/2006/wordprocessingDrawing" xmlns:w10="urn:schemas-microsoft-com:office:word" xmlns:w="http://schemas.openxmlformats.org/wordprocessingml/2006/main" xmlns:w14="http://schemas.microsoft.com/office/word/2010/wordml" xmlns:w15="http://schemas.microsoft.com/office/word/2012/wordml" xmlns:w16cex="http://schemas.microsoft.com/office/word/2018/wordml/cex" xmlns:w16cid="http://schemas.microsoft.com/office/word/2016/wordml/cid" xmlns:w16="http://schemas.microsoft.com/office/word/2018/wordml" xmlns:w16sdtdh="http://schemas.microsoft.com/office/word/2020/wordml/sdtdatahash" xmlns:w16se="http://schemas.microsoft.com/office/word/2015/wordml/symex" xmlns:wpg="http://schemas.microsoft.com/office/word/2010/wordprocessingGroup" xmlns:wpi="http://schemas.microsoft.com/office/word/2010/wordprocessingInk" xmlns:wne="http://schemas.microsoft.com/office/word/2006/wordml" xmlns:wps="http://schemas.microsoft.com/office/word/2010/wordprocessingShape" mc:Ignorable="w14 w15 w16se w16cid w16 w16cex w16sdtdh wp14">
   <w:p>
     <w:pPr>
@@ -12556,16 +13257,6 @@
 </file>
 
 <file path=word/header1.xml><?xml version="1.0" encoding="utf-8"?>
-<w:hdr xmlns:wpc="http://schemas.microsoft.com/office/word/2010/wordprocessingCanvas" xmlns:cx="http://schemas.microsoft.com/office/drawing/2014/chartex" xmlns:cx1="http://schemas.microsoft.com/office/drawing/2015/9/8/chartex" xmlns:cx2="http://schemas.microsoft.com/office/drawing/2015/10/21/chartex" xmlns:cx3="http://schemas.microsoft.com/office/drawing/2016/5/9/chartex" xmlns:cx4="http://schemas.microsoft.com/office/drawing/2016/5/10/chartex" xmlns:cx5="http://schemas.microsoft.com/office/drawing/2016/5/11/chartex" xmlns:cx6="http://schemas.microsoft.com/office/drawing/2016/5/12/chartex" xmlns:cx7="http://schemas.microsoft.com/office/drawing/2016/5/13/chartex" xmlns:cx8="http://schemas.microsoft.com/office/drawing/2016/5/14/chartex" xmlns:mc="http://schemas.openxmlformats.org/markup-compatibility/2006" xmlns:aink="http://schemas.microsoft.com/office/drawing/2016/ink" xmlns:am3d="http://schemas.microsoft.com/office/drawing/2017/model3d" xmlns:o="urn:schemas-microsoft-com:office:office" xmlns:oel="http://schemas.microsoft.com/office/2019/extlst" xmlns:r="http://schemas.openxmlformats.org/officeDocument/2006/relationships" xmlns:m="http://schemas.openxmlformats.org/officeDocument/2006/math" xmlns:v="urn:schemas-microsoft-com:vml" xmlns:wp14="http://schemas.microsoft.com/office/word/2010/wordprocessingDrawing" xmlns:wp="http://schemas.openxmlformats.org/drawingml/2006/wordprocessingDrawing" xmlns:w10="urn:schemas-microsoft-com:office:word" xmlns:w="http://schemas.openxmlformats.org/wordprocessingml/2006/main" xmlns:w14="http://schemas.microsoft.com/office/word/2010/wordml" xmlns:w15="http://schemas.microsoft.com/office/word/2012/wordml" xmlns:w16cex="http://schemas.microsoft.com/office/word/2018/wordml/cex" xmlns:w16cid="http://schemas.microsoft.com/office/word/2016/wordml/cid" xmlns:w16="http://schemas.microsoft.com/office/word/2018/wordml" xmlns:w16sdtdh="http://schemas.microsoft.com/office/word/2020/wordml/sdtdatahash" xmlns:w16se="http://schemas.microsoft.com/office/word/2015/wordml/symex" xmlns:wpg="http://schemas.microsoft.com/office/word/2010/wordprocessingGroup" xmlns:wpi="http://schemas.microsoft.com/office/word/2010/wordprocessingInk" xmlns:wne="http://schemas.microsoft.com/office/word/2006/wordml" xmlns:wps="http://schemas.microsoft.com/office/word/2010/wordprocessingShape" mc:Ignorable="w14 w15 w16se w16cid w16 w16cex w16sdtdh wp14">
-  <w:p>
-    <w:pPr>
-      <w:pStyle w:val="Encabezado"/>
-    </w:pPr>
-  </w:p>
-</w:hdr>
-</file>
-
-<file path=word/header2.xml><?xml version="1.0" encoding="utf-8"?>
 <w:hdr xmlns:wpc="http://schemas.microsoft.com/office/word/2010/wordprocessingCanvas" xmlns:cx="http://schemas.microsoft.com/office/drawing/2014/chartex" xmlns:cx1="http://schemas.microsoft.com/office/drawing/2015/9/8/chartex" xmlns:cx2="http://schemas.microsoft.com/office/drawing/2015/10/21/chartex" xmlns:cx3="http://schemas.microsoft.com/office/drawing/2016/5/9/chartex" xmlns:cx4="http://schemas.microsoft.com/office/drawing/2016/5/10/chartex" xmlns:cx5="http://schemas.microsoft.com/office/drawing/2016/5/11/chartex" xmlns:cx6="http://schemas.microsoft.com/office/drawing/2016/5/12/chartex" xmlns:cx7="http://schemas.microsoft.com/office/drawing/2016/5/13/chartex" xmlns:cx8="http://schemas.microsoft.com/office/drawing/2016/5/14/chartex" xmlns:mc="http://schemas.openxmlformats.org/markup-compatibility/2006" xmlns:aink="http://schemas.microsoft.com/office/drawing/2016/ink" xmlns:am3d="http://schemas.microsoft.com/office/drawing/2017/model3d" xmlns:o="urn:schemas-microsoft-com:office:office" xmlns:oel="http://schemas.microsoft.com/office/2019/extlst" xmlns:r="http://schemas.openxmlformats.org/officeDocument/2006/relationships" xmlns:m="http://schemas.openxmlformats.org/officeDocument/2006/math" xmlns:v="urn:schemas-microsoft-com:vml" xmlns:wp14="http://schemas.microsoft.com/office/word/2010/wordprocessingDrawing" xmlns:wp="http://schemas.openxmlformats.org/drawingml/2006/wordprocessingDrawing" xmlns:w10="urn:schemas-microsoft-com:office:word" xmlns:w="http://schemas.openxmlformats.org/wordprocessingml/2006/main" xmlns:w14="http://schemas.microsoft.com/office/word/2010/wordml" xmlns:w15="http://schemas.microsoft.com/office/word/2012/wordml" xmlns:w16cex="http://schemas.microsoft.com/office/word/2018/wordml/cex" xmlns:w16cid="http://schemas.microsoft.com/office/word/2016/wordml/cid" xmlns:w16="http://schemas.microsoft.com/office/word/2018/wordml" xmlns:w16sdtdh="http://schemas.microsoft.com/office/word/2020/wordml/sdtdatahash" xmlns:w16se="http://schemas.microsoft.com/office/word/2015/wordml/symex" xmlns:wpg="http://schemas.microsoft.com/office/word/2010/wordprocessingGroup" xmlns:wpi="http://schemas.microsoft.com/office/word/2010/wordprocessingInk" xmlns:wne="http://schemas.microsoft.com/office/word/2006/wordml" xmlns:wps="http://schemas.microsoft.com/office/word/2010/wordprocessingShape" mc:Ignorable="w14 w15 w16se w16cid w16 w16cex w16sdtdh wp14">
   <w:p>
     <w:pPr>
@@ -12831,7 +13522,23 @@
                     <w:rFonts w:ascii="Arial" w:hAnsi="Arial"/>
                     <w:sz w:val="10"/>
                   </w:rPr>
-                  <w:t>Av. 20 de Noviembre No. 21</w:t>
+                  <w:t xml:space="preserve">Av. 20 de </w:t>
+                </w:r>
+                <w:proofErr w:type="gramStart"/>
+                <w:r>
+                  <w:rPr>
+                    <w:rFonts w:ascii="Arial" w:hAnsi="Arial"/>
+                    <w:sz w:val="10"/>
+                  </w:rPr>
+                  <w:t>Noviembre</w:t>
+                </w:r>
+                <w:proofErr w:type="gramEnd"/>
+                <w:r>
+                  <w:rPr>
+                    <w:rFonts w:ascii="Arial" w:hAnsi="Arial"/>
+                    <w:sz w:val="10"/>
+                  </w:rPr>
+                  <w:t xml:space="preserve"> No. 21</w:t>
                 </w:r>
                 <w:r>
                   <w:rPr>
@@ -13587,17 +14294,7 @@
 </w:hdr>
 </file>
 
-<file path=word/header3.xml><?xml version="1.0" encoding="utf-8"?>
-<w:hdr xmlns:wpc="http://schemas.microsoft.com/office/word/2010/wordprocessingCanvas" xmlns:cx="http://schemas.microsoft.com/office/drawing/2014/chartex" xmlns:cx1="http://schemas.microsoft.com/office/drawing/2015/9/8/chartex" xmlns:cx2="http://schemas.microsoft.com/office/drawing/2015/10/21/chartex" xmlns:cx3="http://schemas.microsoft.com/office/drawing/2016/5/9/chartex" xmlns:cx4="http://schemas.microsoft.com/office/drawing/2016/5/10/chartex" xmlns:cx5="http://schemas.microsoft.com/office/drawing/2016/5/11/chartex" xmlns:cx6="http://schemas.microsoft.com/office/drawing/2016/5/12/chartex" xmlns:cx7="http://schemas.microsoft.com/office/drawing/2016/5/13/chartex" xmlns:cx8="http://schemas.microsoft.com/office/drawing/2016/5/14/chartex" xmlns:mc="http://schemas.openxmlformats.org/markup-compatibility/2006" xmlns:aink="http://schemas.microsoft.com/office/drawing/2016/ink" xmlns:am3d="http://schemas.microsoft.com/office/drawing/2017/model3d" xmlns:o="urn:schemas-microsoft-com:office:office" xmlns:oel="http://schemas.microsoft.com/office/2019/extlst" xmlns:r="http://schemas.openxmlformats.org/officeDocument/2006/relationships" xmlns:m="http://schemas.openxmlformats.org/officeDocument/2006/math" xmlns:v="urn:schemas-microsoft-com:vml" xmlns:wp14="http://schemas.microsoft.com/office/word/2010/wordprocessingDrawing" xmlns:wp="http://schemas.openxmlformats.org/drawingml/2006/wordprocessingDrawing" xmlns:w10="urn:schemas-microsoft-com:office:word" xmlns:w="http://schemas.openxmlformats.org/wordprocessingml/2006/main" xmlns:w14="http://schemas.microsoft.com/office/word/2010/wordml" xmlns:w15="http://schemas.microsoft.com/office/word/2012/wordml" xmlns:w16cex="http://schemas.microsoft.com/office/word/2018/wordml/cex" xmlns:w16cid="http://schemas.microsoft.com/office/word/2016/wordml/cid" xmlns:w16="http://schemas.microsoft.com/office/word/2018/wordml" xmlns:w16sdtdh="http://schemas.microsoft.com/office/word/2020/wordml/sdtdatahash" xmlns:w16se="http://schemas.microsoft.com/office/word/2015/wordml/symex" xmlns:wpg="http://schemas.microsoft.com/office/word/2010/wordprocessingGroup" xmlns:wpi="http://schemas.microsoft.com/office/word/2010/wordprocessingInk" xmlns:wne="http://schemas.microsoft.com/office/word/2006/wordml" xmlns:wps="http://schemas.microsoft.com/office/word/2010/wordprocessingShape" mc:Ignorable="w14 w15 w16se w16cid w16 w16cex w16sdtdh wp14">
-  <w:p>
-    <w:pPr>
-      <w:pStyle w:val="Encabezado"/>
-    </w:pPr>
-  </w:p>
-</w:hdr>
-</file>
-
-<file path=word/header4.xml><?xml version="1.0" encoding="utf-8"?>
+<file path=word/header2.xml><?xml version="1.0" encoding="utf-8"?>
 <w:hdr xmlns:wpc="http://schemas.microsoft.com/office/word/2010/wordprocessingCanvas" xmlns:cx="http://schemas.microsoft.com/office/drawing/2014/chartex" xmlns:cx1="http://schemas.microsoft.com/office/drawing/2015/9/8/chartex" xmlns:cx2="http://schemas.microsoft.com/office/drawing/2015/10/21/chartex" xmlns:cx3="http://schemas.microsoft.com/office/drawing/2016/5/9/chartex" xmlns:cx4="http://schemas.microsoft.com/office/drawing/2016/5/10/chartex" xmlns:cx5="http://schemas.microsoft.com/office/drawing/2016/5/11/chartex" xmlns:cx6="http://schemas.microsoft.com/office/drawing/2016/5/12/chartex" xmlns:cx7="http://schemas.microsoft.com/office/drawing/2016/5/13/chartex" xmlns:cx8="http://schemas.microsoft.com/office/drawing/2016/5/14/chartex" xmlns:mc="http://schemas.openxmlformats.org/markup-compatibility/2006" xmlns:aink="http://schemas.microsoft.com/office/drawing/2016/ink" xmlns:am3d="http://schemas.microsoft.com/office/drawing/2017/model3d" xmlns:o="urn:schemas-microsoft-com:office:office" xmlns:oel="http://schemas.microsoft.com/office/2019/extlst" xmlns:r="http://schemas.openxmlformats.org/officeDocument/2006/relationships" xmlns:m="http://schemas.openxmlformats.org/officeDocument/2006/math" xmlns:v="urn:schemas-microsoft-com:vml" xmlns:wp14="http://schemas.microsoft.com/office/word/2010/wordprocessingDrawing" xmlns:wp="http://schemas.openxmlformats.org/drawingml/2006/wordprocessingDrawing" xmlns:w10="urn:schemas-microsoft-com:office:word" xmlns:w="http://schemas.openxmlformats.org/wordprocessingml/2006/main" xmlns:w14="http://schemas.microsoft.com/office/word/2010/wordml" xmlns:w15="http://schemas.microsoft.com/office/word/2012/wordml" xmlns:w16cex="http://schemas.microsoft.com/office/word/2018/wordml/cex" xmlns:w16cid="http://schemas.microsoft.com/office/word/2016/wordml/cid" xmlns:w16="http://schemas.microsoft.com/office/word/2018/wordml" xmlns:w16sdtdh="http://schemas.microsoft.com/office/word/2020/wordml/sdtdatahash" xmlns:w16se="http://schemas.microsoft.com/office/word/2015/wordml/symex" xmlns:wpg="http://schemas.microsoft.com/office/word/2010/wordprocessingGroup" xmlns:wpi="http://schemas.microsoft.com/office/word/2010/wordprocessingInk" xmlns:wne="http://schemas.microsoft.com/office/word/2006/wordml" xmlns:wps="http://schemas.microsoft.com/office/word/2010/wordprocessingShape" mc:Ignorable="w14 w15 w16se w16cid w16 w16cex w16sdtdh wp14">
   <w:p>
     <w:pPr>
@@ -13807,6 +14504,7 @@
       <w:t xml:space="preserve"> </w:t>
     </w:r>
     <w:proofErr w:type="spellStart"/>
+    <w:proofErr w:type="gramStart"/>
     <w:r>
       <w:rPr>
         <w:rFonts w:ascii="Arial" w:hAnsi="Arial" w:cs="Arial"/>
@@ -13824,7 +14522,17 @@
         <w:bCs/>
         <w:szCs w:val="24"/>
       </w:rPr>
-      <w:t>}/{</w:t>
+      <w:t>}/</w:t>
+    </w:r>
+    <w:proofErr w:type="gramEnd"/>
+    <w:r>
+      <w:rPr>
+        <w:rFonts w:ascii="Arial" w:hAnsi="Arial" w:cs="Arial"/>
+        <w:b/>
+        <w:bCs/>
+        <w:szCs w:val="24"/>
+      </w:rPr>
+      <w:t>{</w:t>
     </w:r>
     <w:proofErr w:type="spellStart"/>
     <w:r>
@@ -13880,7 +14588,7 @@
 </w:hdr>
 </file>
 
-<file path=word/header5.xml><?xml version="1.0" encoding="utf-8"?>
+<file path=word/header3.xml><?xml version="1.0" encoding="utf-8"?>
 <w:hdr xmlns:wpc="http://schemas.microsoft.com/office/word/2010/wordprocessingCanvas" xmlns:cx="http://schemas.microsoft.com/office/drawing/2014/chartex" xmlns:cx1="http://schemas.microsoft.com/office/drawing/2015/9/8/chartex" xmlns:cx2="http://schemas.microsoft.com/office/drawing/2015/10/21/chartex" xmlns:cx3="http://schemas.microsoft.com/office/drawing/2016/5/9/chartex" xmlns:cx4="http://schemas.microsoft.com/office/drawing/2016/5/10/chartex" xmlns:cx5="http://schemas.microsoft.com/office/drawing/2016/5/11/chartex" xmlns:cx6="http://schemas.microsoft.com/office/drawing/2016/5/12/chartex" xmlns:cx7="http://schemas.microsoft.com/office/drawing/2016/5/13/chartex" xmlns:cx8="http://schemas.microsoft.com/office/drawing/2016/5/14/chartex" xmlns:mc="http://schemas.openxmlformats.org/markup-compatibility/2006" xmlns:aink="http://schemas.microsoft.com/office/drawing/2016/ink" xmlns:am3d="http://schemas.microsoft.com/office/drawing/2017/model3d" xmlns:o="urn:schemas-microsoft-com:office:office" xmlns:oel="http://schemas.microsoft.com/office/2019/extlst" xmlns:r="http://schemas.openxmlformats.org/officeDocument/2006/relationships" xmlns:m="http://schemas.openxmlformats.org/officeDocument/2006/math" xmlns:v="urn:schemas-microsoft-com:vml" xmlns:wp14="http://schemas.microsoft.com/office/word/2010/wordprocessingDrawing" xmlns:wp="http://schemas.openxmlformats.org/drawingml/2006/wordprocessingDrawing" xmlns:w10="urn:schemas-microsoft-com:office:word" xmlns:w="http://schemas.openxmlformats.org/wordprocessingml/2006/main" xmlns:w14="http://schemas.microsoft.com/office/word/2010/wordml" xmlns:w15="http://schemas.microsoft.com/office/word/2012/wordml" xmlns:w16cex="http://schemas.microsoft.com/office/word/2018/wordml/cex" xmlns:w16cid="http://schemas.microsoft.com/office/word/2016/wordml/cid" xmlns:w16="http://schemas.microsoft.com/office/word/2018/wordml" xmlns:w16sdtdh="http://schemas.microsoft.com/office/word/2020/wordml/sdtdatahash" xmlns:w16se="http://schemas.microsoft.com/office/word/2015/wordml/symex" xmlns:wpg="http://schemas.microsoft.com/office/word/2010/wordprocessingGroup" xmlns:wpi="http://schemas.microsoft.com/office/word/2010/wordprocessingInk" xmlns:wne="http://schemas.microsoft.com/office/word/2006/wordml" xmlns:wps="http://schemas.microsoft.com/office/word/2010/wordprocessingShape" mc:Ignorable="w14 w15 w16se w16cid w16 w16cex w16sdtdh wp14">
   <w:p>
     <w:pPr>
@@ -14090,6 +14798,7 @@
       <w:t xml:space="preserve"> </w:t>
     </w:r>
     <w:proofErr w:type="spellStart"/>
+    <w:proofErr w:type="gramStart"/>
     <w:r>
       <w:rPr>
         <w:rFonts w:ascii="Arial" w:hAnsi="Arial" w:cs="Arial"/>
@@ -14107,7 +14816,17 @@
         <w:bCs/>
         <w:szCs w:val="24"/>
       </w:rPr>
-      <w:t>}/{</w:t>
+      <w:t>}/</w:t>
+    </w:r>
+    <w:proofErr w:type="gramEnd"/>
+    <w:r>
+      <w:rPr>
+        <w:rFonts w:ascii="Arial" w:hAnsi="Arial" w:cs="Arial"/>
+        <w:b/>
+        <w:bCs/>
+        <w:szCs w:val="24"/>
+      </w:rPr>
+      <w:t>{</w:t>
     </w:r>
     <w:proofErr w:type="spellStart"/>
     <w:r>
@@ -19057,13 +19776,17 @@
         <w:start w:val="1"/>
         <w:numFmt w:val="bullet"/>
         <w:lvlText w:val=""/>
-        <w:legacy w:legacy="1" w:legacySpace="0" w:legacyIndent="283"/>
         <w:lvlJc w:val="left"/>
         <w:pPr>
-          <w:ind w:left="1842" w:hanging="283"/>
+          <w:ind w:left="720" w:hanging="360"/>
         </w:pPr>
         <w:rPr>
           <w:rFonts w:ascii="Symbol" w:hAnsi="Symbol" w:hint="default"/>
+          <w:b/>
+          <w:i w:val="0"/>
+          <w:color w:val="000000"/>
+          <w:sz w:val="20"/>
+          <w:vertAlign w:val="baseline"/>
         </w:rPr>
       </w:lvl>
     </w:lvlOverride>

</xml_diff>